<commit_message>
Cross-reference informatika.docx for lesson 001: add exercises segment
Curriculum F1.1 requires fatigue-relieving exercises to be demonstrated
and practiced ("parodoma ir išbandoma"). Added:
- README: 4th learning objective + success criterion for exercises,
  F1.1 competency reference, updated lesson flow
- Teacher_Plan: new 3-min exercises phase (eyes, wrists, shoulders),
  exit retrieval Q3 changed to exercise demonstration

Co-Authored-By: Claude Opus 4.6 (1M context) <noreply@anthropic.com>
</commit_message>
<xml_diff>
--- a/Grade_9/Semester_1/01_Safety/001_L - Ergonomics & healthy computer use/Teacher_Plan.docx
+++ b/Grade_9/Semester_1/01_Safety/001_L - Ergonomics & healthy computer use/Teacher_Plan.docx
@@ -121,6 +121,29 @@
           <w:sz w:val="22"/>
           <w:szCs w:val="22"/>
         </w:rPr>
+        <w:t xml:space="preserve">Programos nuoroda: </w:t>
+      </w:r>
+      <w:r>
+        <w:rPr>
+          <w:rFonts w:ascii="Arial" w:cs="Arial" w:eastAsia="Arial" w:hAnsi="Arial"/>
+          <w:sz w:val="22"/>
+          <w:szCs w:val="22"/>
+        </w:rPr>
+        <w:t xml:space="preserve">Saugus elgesys F1.1 — „Apibūdina saugaus darbo skaitmeninėmis technologijomis normas.“</w:t>
+      </w:r>
+    </w:p>
+    <w:p>
+      <w:pPr>
+        <w:spacing w:after="120"/>
+      </w:pPr>
+      <w:r>
+        <w:rPr>
+          <w:rFonts w:ascii="Arial" w:cs="Arial" w:eastAsia="Arial" w:hAnsi="Arial"/>
+          <w:b/>
+          <w:bCs/>
+          <w:sz w:val="22"/>
+          <w:szCs w:val="22"/>
+        </w:rPr>
         <w:t xml:space="preserve">Temos ribos: </w:t>
       </w:r>
       <w:r>
@@ -129,7 +152,7 @@
           <w:sz w:val="22"/>
           <w:szCs w:val="22"/>
         </w:rPr>
-        <w:t xml:space="preserve">Ši pamoka apima ergonomikos principus dirbant kompiuteriu: taisyklingą sėdėjimo laikyseną, ekrano atstumą ir kampą, rankų padėtį ant klaviatūros, akių poilsio taisyklę (20-20-20) ir darbo–poilsio ritmą. Neapima interneto saugos, privatumo ar aplinkosaugos temų.</w:t>
+        <w:t xml:space="preserve">Ši pamoka apima ergonomikos principus dirbant kompiuteriu: taisyklingą sėdėjimo laikyseną, ekrano atstumą ir kampą, rankų padėtį ant klaviatūros, akių poilsio taisyklę (20-20-20), nuovargį šalinančius pratimus ir darbo–poilsio ritmą. Neapima interneto saugos, privatumo ar aplinkosaugos temų.</w:t>
       </w:r>
     </w:p>
     <w:p>
@@ -204,6 +227,24 @@
     </w:p>
     <w:p>
       <w:pPr>
+        <w:pStyle w:val="ListParagraph"/>
+        <w:numPr>
+          <w:ilvl w:val="0"/>
+          <w:numId w:val="2"/>
+        </w:numPr>
+        <w:spacing w:after="60"/>
+      </w:pPr>
+      <w:r>
+        <w:rPr>
+          <w:rFonts w:ascii="Arial" w:cs="Arial" w:eastAsia="Arial" w:hAnsi="Arial"/>
+          <w:sz w:val="22"/>
+          <w:szCs w:val="22"/>
+        </w:rPr>
+        <w:t xml:space="preserve">Atlikti kelis nuovargį šalinančius pratimus (akių, rankų, nugaros).</w:t>
+      </w:r>
+    </w:p>
+    <w:p>
+      <w:pPr>
         <w:pStyle w:val="Heading2"/>
         <w:spacing w:after="120" w:before="240"/>
       </w:pPr>
@@ -334,7 +375,7 @@
           <w:sz w:val="24"/>
           <w:szCs w:val="24"/>
         </w:rPr>
-        <w:t xml:space="preserve">Dėstymas — ~25 min.</w:t>
+        <w:t xml:space="preserve">Dėstymas — ~22 min.</w:t>
       </w:r>
     </w:p>
     <w:p>
@@ -377,7 +418,7 @@
           <w:sz w:val="22"/>
           <w:szCs w:val="22"/>
         </w:rPr>
-        <w:t xml:space="preserve">Sėdėjimo laikysena ir darbo vieta — ~8 min.</w:t>
+        <w:t xml:space="preserve">Sėdėjimo laikysena ir darbo vieta — ~7 min.</w:t>
       </w:r>
     </w:p>
     <w:p>
@@ -500,7 +541,7 @@
           <w:sz w:val="22"/>
           <w:szCs w:val="22"/>
         </w:rPr>
-        <w:t xml:space="preserve">Akių sveikata ir 20-20-20 taisyklė — ~7 min.</w:t>
+        <w:t xml:space="preserve">Akių sveikata ir 20-20-20 taisyklė — ~6 min.</w:t>
       </w:r>
     </w:p>
     <w:p>
@@ -551,7 +592,7 @@
           <w:sz w:val="22"/>
           <w:szCs w:val="22"/>
         </w:rPr>
-        <w:t xml:space="preserve">Darbo–poilsio ritmas ir pertraukos — ~5 min.</w:t>
+        <w:t xml:space="preserve">Darbo–poilsio ritmas ir pertraukos — ~4 min.</w:t>
       </w:r>
     </w:p>
     <w:p>
@@ -587,7 +628,7 @@
           <w:sz w:val="22"/>
           <w:szCs w:val="22"/>
         </w:rPr>
-        <w:t xml:space="preserve">mokiniai linkę manyti, kad pajėgumas sėdėti ilgai reiškia, jog pertraukos nereikalingos. Paaiškinkite, kad simptomai pasirodo ne iš karto, o kaupiasi.</w:t>
+        <w:t xml:space="preserve">mokiniai linkę manyti, kad pajėgumas sėdėti ilgai reiškia, jog pertraukos nereikalingos. Paaiškinkite, kad simptomai kaupiasi.</w:t>
       </w:r>
     </w:p>
     <w:p>
@@ -603,7 +644,127 @@
           <w:sz w:val="24"/>
           <w:szCs w:val="24"/>
         </w:rPr>
-        <w:t xml:space="preserve">Apibendrinimas su klase — ~3 min.</w:t>
+        <w:t xml:space="preserve">Nuovargį šalinantys pratimai ir apibendrinimas — ~5 min.</w:t>
+      </w:r>
+    </w:p>
+    <w:p>
+      <w:pPr>
+        <w:spacing w:after="120"/>
+      </w:pPr>
+      <w:r>
+        <w:rPr>
+          <w:rFonts w:ascii="Arial" w:cs="Arial" w:eastAsia="Arial" w:hAnsi="Arial"/>
+          <w:b/>
+          <w:bCs/>
+          <w:sz w:val="22"/>
+          <w:szCs w:val="22"/>
+        </w:rPr>
+        <w:t xml:space="preserve">Pratimų demonstravimas ir išbandymas — ~3 min.</w:t>
+      </w:r>
+    </w:p>
+    <w:p>
+      <w:pPr>
+        <w:spacing w:after="120"/>
+      </w:pPr>
+      <w:r>
+        <w:rPr>
+          <w:rFonts w:ascii="Arial" w:cs="Arial" w:eastAsia="Arial" w:hAnsi="Arial"/>
+          <w:sz w:val="22"/>
+          <w:szCs w:val="22"/>
+        </w:rPr>
+        <w:t xml:space="preserve">Parodykite 3 pratimus ir atlikite juos kartu su klase:</w:t>
+      </w:r>
+    </w:p>
+    <w:p>
+      <w:pPr>
+        <w:pStyle w:val="ListParagraph"/>
+        <w:numPr>
+          <w:ilvl w:val="0"/>
+          <w:numId w:val="4"/>
+        </w:numPr>
+        <w:spacing w:after="60"/>
+      </w:pPr>
+      <w:r>
+        <w:rPr>
+          <w:rFonts w:ascii="Arial" w:cs="Arial" w:eastAsia="Arial" w:hAnsi="Arial"/>
+          <w:sz w:val="22"/>
+          <w:szCs w:val="22"/>
+        </w:rPr>
+        <w:t xml:space="preserve">Akys: užmerkite 5 sek., tada pažiūrėkite į tolimiausią tašką pro langą. Pakartokite 3 kartus.</w:t>
+      </w:r>
+    </w:p>
+    <w:p>
+      <w:pPr>
+        <w:pStyle w:val="ListParagraph"/>
+        <w:numPr>
+          <w:ilvl w:val="0"/>
+          <w:numId w:val="4"/>
+        </w:numPr>
+        <w:spacing w:after="60"/>
+      </w:pPr>
+      <w:r>
+        <w:rPr>
+          <w:rFonts w:ascii="Arial" w:cs="Arial" w:eastAsia="Arial" w:hAnsi="Arial"/>
+          <w:sz w:val="22"/>
+          <w:szCs w:val="22"/>
+        </w:rPr>
+        <w:t xml:space="preserve">Rankos / riešai: sukiokite riešus ratu 10 sek. į vieną pusę, 10 sek. į kitą. Tada ištieskite pirštus ir suspauskitę į kumštį 5 kartus.</w:t>
+      </w:r>
+    </w:p>
+    <w:p>
+      <w:pPr>
+        <w:pStyle w:val="ListParagraph"/>
+        <w:numPr>
+          <w:ilvl w:val="0"/>
+          <w:numId w:val="4"/>
+        </w:numPr>
+        <w:spacing w:after="60"/>
+      </w:pPr>
+      <w:r>
+        <w:rPr>
+          <w:rFonts w:ascii="Arial" w:cs="Arial" w:eastAsia="Arial" w:hAnsi="Arial"/>
+          <w:sz w:val="22"/>
+          <w:szCs w:val="22"/>
+        </w:rPr>
+        <w:t xml:space="preserve">Nugara / pečiai: pakelkite pečius prie ausų, palaikykite 3 sek., atleiskite. Pakartokite 3 kartus.</w:t>
+      </w:r>
+    </w:p>
+    <w:p>
+      <w:pPr>
+        <w:spacing w:after="120"/>
+      </w:pPr>
+      <w:r>
+        <w:rPr>
+          <w:rFonts w:ascii="Arial" w:cs="Arial" w:eastAsia="Arial" w:hAnsi="Arial"/>
+          <w:b/>
+          <w:bCs/>
+          <w:sz w:val="22"/>
+          <w:szCs w:val="22"/>
+        </w:rPr>
+        <w:t xml:space="preserve">Pastaba: </w:t>
+      </w:r>
+      <w:r>
+        <w:rPr>
+          <w:rFonts w:ascii="Arial" w:cs="Arial" w:eastAsia="Arial" w:hAnsi="Arial"/>
+          <w:sz w:val="22"/>
+          <w:szCs w:val="22"/>
+        </w:rPr>
+        <w:t xml:space="preserve">programa reikalauja, kad pratimai būtų ne tik parodyti, bet ir išbandyti (F1.1).</w:t>
+      </w:r>
+    </w:p>
+    <w:p>
+      <w:pPr>
+        <w:spacing w:after="120"/>
+      </w:pPr>
+      <w:r>
+        <w:rPr>
+          <w:rFonts w:ascii="Arial" w:cs="Arial" w:eastAsia="Arial" w:hAnsi="Arial"/>
+          <w:b/>
+          <w:bCs/>
+          <w:sz w:val="22"/>
+          <w:szCs w:val="22"/>
+        </w:rPr>
+        <w:t xml:space="preserve">Apibendrinimas su klase — ~2 min.</w:t>
       </w:r>
     </w:p>
     <w:p>
@@ -617,19 +778,6 @@
           <w:szCs w:val="22"/>
         </w:rPr>
         <w:t xml:space="preserve">Paklauskite mokinių: „Kokius 3 dalykus pakeistumėte savo darbo vietoje namuose?“ 2–3 mokiniai atsako žodžiu.</w:t>
-      </w:r>
-    </w:p>
-    <w:p>
-      <w:pPr>
-        <w:spacing w:after="120"/>
-      </w:pPr>
-      <w:r>
-        <w:rPr>
-          <w:rFonts w:ascii="Arial" w:cs="Arial" w:eastAsia="Arial" w:hAnsi="Arial"/>
-          <w:sz w:val="22"/>
-          <w:szCs w:val="22"/>
-        </w:rPr>
-        <w:t xml:space="preserve">Mokiniai vertina savo laikyseną realiame kontekste — tai padeda perkelti žinias iš pamokos į kasdienybę.</w:t>
       </w:r>
     </w:p>
     <w:p>
@@ -712,7 +860,7 @@
           <w:sz w:val="22"/>
           <w:szCs w:val="22"/>
         </w:rPr>
-        <w:t xml:space="preserve">Kodėl pertraukos svarbios, net jei neskauda?</w:t>
+        <w:t xml:space="preserve">Parodykite vieną pratimą, kurį galima atlikti per pertrauką prie kompiuterio.</w:t>
       </w:r>
     </w:p>
     <w:p>
@@ -741,7 +889,7 @@
           <w:sz w:val="22"/>
           <w:szCs w:val="22"/>
         </w:rPr>
-        <w:t xml:space="preserve">Pamokoje mokiniai susipažino su ergonomikos principais dirbant kompiuteriu. Nagrinėjo taisyklingos sėdėjimo laikysenos, ekrano padėties, rankų pozicijos ir akių poilsio taisykles. Aptarė 20-20-20 taisyklę ir darbo–poilsio ritmo svarbą ilgalaikei sveikatai.</w:t>
+        <w:t xml:space="preserve">Pamokoje mokiniai susipažino su ergonomikos principais dirbant kompiuteriu. Nagrinėjo taisyklingos sėdėjimo laikysenos, ekrano padėties, rankų pozicijos ir akių poilsio taisykles. Aptarė 20-20-20 taisyklę, darbo–poilsio ritmo svarbą ir išbandė nuovargį šalinančius pratimus.</w:t>
       </w:r>
     </w:p>
     <w:sectPr>

</xml_diff>

<commit_message>
docx to pdf skill updates.
</commit_message>
<xml_diff>
--- a/Grade_9/Semester_1/01_Safety/001_L - Ergonomics & healthy computer use/Teacher_Plan.docx
+++ b/Grade_9/Semester_1/01_Safety/001_L - Ergonomics & healthy computer use/Teacher_Plan.docx
@@ -24,6 +24,11 @@
           <w:bottom w:val="single" w:sz="48" w:space="0" w:color="1565C0"/>
         </w:pBdr>
         <w:spacing w:after="200"/>
+      </w:pPr>
+    </w:p>
+    <w:p>
+      <w:pPr>
+        <w:spacing w:before="100"/>
       </w:pPr>
     </w:p>
     <w:tbl>
@@ -34,8 +39,8 @@
           <w:left w:val="none" w:sz="0" w:space="0" w:color="FFFFFF"/>
           <w:bottom w:val="none" w:sz="0" w:space="0" w:color="FFFFFF"/>
           <w:right w:val="none" w:sz="0" w:space="0" w:color="FFFFFF"/>
-          <w:insideH w:val="single" w:sz="4" w:space="0" w:color="auto"/>
-          <w:insideV w:val="single" w:sz="4" w:space="0" w:color="auto"/>
+          <w:insideH w:val="none" w:sz="0" w:space="0" w:color="FFFFFF"/>
+          <w:insideV w:val="none" w:sz="0" w:space="0" w:color="FFFFFF"/>
         </w:tblBorders>
         <w:tblLayout w:type="fixed"/>
         <w:tblCellMar>
@@ -394,16 +399,7 @@
                 <w:sz w:val="22"/>
                 <w:szCs w:val="22"/>
               </w:rPr>
-              <w:t>Ši pamoka apima ergonomikos principus dirbant kompiuteriu: taisyklingą sėdėjimo laikyseną, ekrano atstumą ir kampą, rankų padėtį, akių poilsio taisyklę (20-20-20), nuovargį šalinančius pratimus ir darbo–poilsio ritmą. Neapima privatumo, paskyrų saugos ar r</w:t>
-            </w:r>
-            <w:r>
-              <w:rPr>
-                <w:rFonts w:ascii="Arial" w:eastAsia="Arial" w:hAnsi="Arial" w:cs="Arial"/>
-                <w:color w:val="212121"/>
-                <w:sz w:val="22"/>
-                <w:szCs w:val="22"/>
-              </w:rPr>
-              <w:t>izikų internete.</w:t>
+              <w:t>Ergonomikos pagrindai: laikysena, ekrano padėtis ir atstumas, rankų pozicija, akių poilsio taisyklė (20-20-20), nuovargį šalinantys pratimai, darbo ir poilsio ritmas. Neapima psichologinių aspektų, priklausomybės ar socialinių temų.</w:t>
             </w:r>
           </w:p>
         </w:tc>
@@ -422,8 +418,8 @@
           <w:left w:val="none" w:sz="0" w:space="0" w:color="FFFFFF"/>
           <w:bottom w:val="none" w:sz="0" w:space="0" w:color="FFFFFF"/>
           <w:right w:val="none" w:sz="0" w:space="0" w:color="FFFFFF"/>
-          <w:insideH w:val="single" w:sz="4" w:space="0" w:color="auto"/>
-          <w:insideV w:val="single" w:sz="4" w:space="0" w:color="auto"/>
+          <w:insideH w:val="none" w:sz="0" w:space="0" w:color="FFFFFF"/>
+          <w:insideV w:val="none" w:sz="0" w:space="0" w:color="FFFFFF"/>
         </w:tblBorders>
         <w:tblLayout w:type="fixed"/>
         <w:tblCellMar>
@@ -480,7 +476,7 @@
           </w:p>
           <w:p>
             <w:pPr>
-              <w:spacing w:after="40"/>
+              <w:spacing w:after="60"/>
             </w:pPr>
             <w:r>
               <w:rPr>
@@ -511,12 +507,21 @@
                 <w:sz w:val="22"/>
                 <w:szCs w:val="22"/>
               </w:rPr>
-              <w:t>Įvardinti pagrindinius ergonomikos principus (laikysena, ekrano padėtis, rankų pozicija, pertraukos).</w:t>
+              <w:t>Įva</w:t>
+            </w:r>
+            <w:r>
+              <w:rPr>
+                <w:rFonts w:ascii="Arial" w:eastAsia="Arial" w:hAnsi="Arial" w:cs="Arial"/>
+                <w:color w:val="212121"/>
+                <w:sz w:val="22"/>
+                <w:szCs w:val="22"/>
+              </w:rPr>
+              <w:t>rdinti pagrindinius ergonomikos principus (laikysena, ekrano padėtis, rankų pozicija, pertraukos).</w:t>
             </w:r>
           </w:p>
           <w:p>
             <w:pPr>
-              <w:spacing w:after="40"/>
+              <w:spacing w:after="60"/>
             </w:pPr>
             <w:r>
               <w:rPr>
@@ -552,7 +557,7 @@
           </w:p>
           <w:p>
             <w:pPr>
-              <w:spacing w:after="40"/>
+              <w:spacing w:after="60"/>
             </w:pPr>
             <w:r>
               <w:rPr>
@@ -583,7 +588,7 @@
                 <w:sz w:val="22"/>
                 <w:szCs w:val="22"/>
               </w:rPr>
-              <w:t>Pademonstruoti taisyklingą s</w:t>
+              <w:t>Pademonstruoti taisyklingą sėdėjimo pozą ir ekrano padėtį savo darbo</w:t>
             </w:r>
             <w:r>
               <w:rPr>
@@ -592,13 +597,10 @@
                 <w:sz w:val="22"/>
                 <w:szCs w:val="22"/>
               </w:rPr>
-              <w:t>ėdėjimo pozą ir ekrano padėtį savo darbo vietoje.</w:t>
+              <w:t xml:space="preserve"> vietoje.</w:t>
             </w:r>
           </w:p>
           <w:p>
-            <w:pPr>
-              <w:spacing w:after="40"/>
-            </w:pPr>
             <w:r>
               <w:rPr>
                 <w:rFonts w:ascii="Arial" w:eastAsia="Arial" w:hAnsi="Arial" w:cs="Arial"/>
@@ -647,8 +649,8 @@
           <w:left w:val="none" w:sz="0" w:space="0" w:color="FFFFFF"/>
           <w:bottom w:val="none" w:sz="0" w:space="0" w:color="FFFFFF"/>
           <w:right w:val="none" w:sz="0" w:space="0" w:color="FFFFFF"/>
-          <w:insideH w:val="single" w:sz="4" w:space="0" w:color="auto"/>
-          <w:insideV w:val="single" w:sz="4" w:space="0" w:color="auto"/>
+          <w:insideH w:val="none" w:sz="0" w:space="0" w:color="FFFFFF"/>
+          <w:insideV w:val="none" w:sz="0" w:space="0" w:color="FFFFFF"/>
         </w:tblBorders>
         <w:tblLayout w:type="fixed"/>
         <w:tblCellMar>
@@ -726,13 +728,14 @@
     </w:tbl>
     <w:p>
       <w:pPr>
-        <w:spacing w:before="80"/>
-      </w:pPr>
-    </w:p>
-    <w:p>
-      <w:pPr>
         <w:keepNext/>
         <w:spacing w:after="80"/>
+        <w:rPr>
+          <w:rFonts w:ascii="Arial" w:eastAsia="Arial" w:hAnsi="Arial" w:cs="Arial"/>
+          <w:color w:val="212121"/>
+          <w:sz w:val="22"/>
+          <w:szCs w:val="22"/>
+        </w:rPr>
       </w:pPr>
       <w:r>
         <w:rPr>
@@ -752,21 +755,28 @@
           <w:sz w:val="22"/>
           <w:szCs w:val="22"/>
         </w:rPr>
-        <w:t>žodinis.</w:t>
-      </w:r>
-    </w:p>
-    <w:p>
-      <w:pPr>
-        <w:spacing w:after="80"/>
-      </w:pPr>
-      <w:r>
-        <w:rPr>
-          <w:rFonts w:ascii="Arial" w:eastAsia="Arial" w:hAnsi="Arial" w:cs="Arial"/>
-          <w:color w:val="212121"/>
-          <w:sz w:val="22"/>
-          <w:szCs w:val="22"/>
-        </w:rPr>
-        <w:t>Tai pirma metų pamoka — klausimai remiasi bendra patirtimi, ne praeita pamoka.</w:t>
+        <w:t>žodinis, klausinėjimas pasirinktinai.</w:t>
+      </w:r>
+    </w:p>
+    <w:p>
+      <w:pPr>
+        <w:keepNext/>
+        <w:spacing w:after="80"/>
+      </w:pPr>
+    </w:p>
+    <w:p>
+      <w:pPr>
+        <w:keepNext/>
+        <w:spacing w:after="80"/>
+      </w:pPr>
+      <w:r>
+        <w:rPr>
+          <w:rFonts w:ascii="Arial" w:eastAsia="Arial" w:hAnsi="Arial" w:cs="Arial"/>
+          <w:color w:val="212121"/>
+          <w:sz w:val="22"/>
+          <w:szCs w:val="22"/>
+        </w:rPr>
+        <w:t>Tai pirma metų informatikos pamoka. Atgaminimo klausimų iš ankstesnių pamokų nėra. Paklauskite bendro pobūdžio klausimų, kad užmegztumėte ryšį su tema.</w:t>
       </w:r>
     </w:p>
     <w:p>
@@ -792,7 +802,7 @@
           <w:sz w:val="22"/>
           <w:szCs w:val="22"/>
         </w:rPr>
-        <w:t>Ar tau kartais skauda nugarą arba akis po ilgo darbo prie kompiuterio? Kodėl taip manai?</w:t>
+        <w:t>Kas nutinka jūsų akims, kai ilgai žiūrite į ekraną be pertraukos?</w:t>
       </w:r>
     </w:p>
     <w:p>
@@ -818,7 +828,7 @@
           <w:sz w:val="22"/>
           <w:szCs w:val="22"/>
         </w:rPr>
-        <w:t>Kiek laiko iš eilės paprastai sėdi prie ekrano namuose?</w:t>
+        <w:t>Ar pradėjus skaudėti nugarą galima iš karto suprasti priežastį? Kodėl?</w:t>
       </w:r>
     </w:p>
     <w:p>
@@ -844,12 +854,12 @@
           <w:sz w:val="22"/>
           <w:szCs w:val="22"/>
         </w:rPr>
-        <w:t>Ar esi girdėjęs kokią nors taisyklę apie sveiką kompiuterio naudojimą?</w:t>
-      </w:r>
-    </w:p>
-    <w:p>
-      <w:pPr>
-        <w:spacing w:before="60" w:after="80"/>
+        <w:t>Kiek laiko per dieną praleidžiate prie ekrano (telefonas + kompiuteris)?</w:t>
+      </w:r>
+    </w:p>
+    <w:p>
+      <w:pPr>
+        <w:spacing w:after="80"/>
         <w:ind w:left="240"/>
       </w:pPr>
       <w:r>
@@ -859,7 +869,7 @@
           <w:iCs/>
           <w:color w:val="616161"/>
         </w:rPr>
-        <w:t>(Ryšys su nauja tema: „Šiandien sužinosime, kodėl šie dalykai vyksta ir kaip jų išvengti — tai vadinasi ergonomika.“)</w:t>
+        <w:t>(Šie klausimai atveria temą: kaip elgtis, kad ilgalaikis darbas prie kompiuterio nekenktų sveikatai.)</w:t>
       </w:r>
     </w:p>
     <w:p>
@@ -875,8 +885,8 @@
           <w:left w:val="none" w:sz="0" w:space="0" w:color="FFFFFF"/>
           <w:bottom w:val="none" w:sz="0" w:space="0" w:color="FFFFFF"/>
           <w:right w:val="none" w:sz="0" w:space="0" w:color="FFFFFF"/>
-          <w:insideH w:val="single" w:sz="4" w:space="0" w:color="auto"/>
-          <w:insideV w:val="single" w:sz="4" w:space="0" w:color="auto"/>
+          <w:insideH w:val="none" w:sz="0" w:space="0" w:color="FFFFFF"/>
+          <w:insideV w:val="none" w:sz="0" w:space="0" w:color="FFFFFF"/>
         </w:tblBorders>
         <w:tblLayout w:type="fixed"/>
         <w:tblCellMar>
@@ -939,7 +949,18 @@
                 <w:sz w:val="24"/>
                 <w:szCs w:val="24"/>
               </w:rPr>
-              <w:t>Dėstymas</w:t>
+              <w:t>Dėsty</w:t>
+            </w:r>
+            <w:r>
+              <w:rPr>
+                <w:rFonts w:ascii="Arial" w:eastAsia="Arial" w:hAnsi="Arial" w:cs="Arial"/>
+                <w:b/>
+                <w:bCs/>
+                <w:color w:val="1565C0"/>
+                <w:sz w:val="24"/>
+                <w:szCs w:val="24"/>
+              </w:rPr>
+              <w:t>mas</w:t>
             </w:r>
             <w:r>
               <w:rPr>
@@ -954,15 +975,8 @@
     </w:tbl>
     <w:p>
       <w:pPr>
-        <w:spacing w:before="80"/>
-      </w:pPr>
-    </w:p>
-    <w:p>
-      <w:pPr>
         <w:keepNext/>
         <w:spacing w:after="80"/>
-      </w:pPr>
-      <w:r>
         <w:rPr>
           <w:rFonts w:ascii="Arial" w:eastAsia="Arial" w:hAnsi="Arial" w:cs="Arial"/>
           <w:b/>
@@ -971,21 +985,6 @@
           <w:sz w:val="22"/>
           <w:szCs w:val="22"/>
         </w:rPr>
-        <w:t xml:space="preserve">Pamokos fokusas (~2 min.): </w:t>
-      </w:r>
-      <w:r>
-        <w:rPr>
-          <w:rFonts w:ascii="Arial" w:eastAsia="Arial" w:hAnsi="Arial" w:cs="Arial"/>
-          <w:color w:val="212121"/>
-          <w:sz w:val="22"/>
-          <w:szCs w:val="22"/>
-        </w:rPr>
-        <w:t>parodykite ekrane žmogų, sėdintį netaisyklingai prie kompiuterio. Paklauskite: „Kas čia blogai?“ Surinkite 2–3 atsakymus ir pasakykite, kad šiandien sistemingai viską aptarsite.</w:t>
-      </w:r>
-    </w:p>
-    <w:p>
-      <w:pPr>
-        <w:spacing w:before="80"/>
       </w:pPr>
     </w:p>
     <w:p>
@@ -1002,96 +1001,97 @@
           <w:sz w:val="22"/>
           <w:szCs w:val="22"/>
         </w:rPr>
-        <w:t xml:space="preserve">Laikysena ir sėdėjimas (~5 min.): </w:t>
-      </w:r>
-    </w:p>
-    <w:p>
-      <w:pPr>
-        <w:spacing w:after="80"/>
-      </w:pPr>
-      <w:r>
-        <w:rPr>
-          <w:rFonts w:ascii="Arial" w:eastAsia="Arial" w:hAnsi="Arial" w:cs="Arial"/>
-          <w:color w:val="212121"/>
-          <w:sz w:val="22"/>
-          <w:szCs w:val="22"/>
-        </w:rPr>
-        <w:t>Paaiškinkite taisyklingos laikysenos princ</w:t>
-      </w:r>
-      <w:r>
-        <w:rPr>
-          <w:rFonts w:ascii="Arial" w:eastAsia="Arial" w:hAnsi="Arial" w:cs="Arial"/>
-          <w:color w:val="212121"/>
-          <w:sz w:val="22"/>
-          <w:szCs w:val="22"/>
-        </w:rPr>
-        <w:t>ipus. Demonstruokite prie savo stalo:</w:t>
-      </w:r>
-    </w:p>
-    <w:p>
-      <w:pPr>
-        <w:spacing w:after="80"/>
-      </w:pPr>
-      <w:r>
-        <w:rPr>
-          <w:rFonts w:ascii="Arial" w:eastAsia="Arial" w:hAnsi="Arial" w:cs="Arial"/>
-          <w:color w:val="212121"/>
-          <w:sz w:val="22"/>
-          <w:szCs w:val="22"/>
-        </w:rPr>
-        <w:t>• Nugaros atrama — nugara liečia kėdės atlošą, ne palinkusi į priekį.</w:t>
-      </w:r>
-    </w:p>
-    <w:p>
-      <w:pPr>
-        <w:spacing w:after="80"/>
-      </w:pPr>
-      <w:r>
-        <w:rPr>
-          <w:rFonts w:ascii="Arial" w:eastAsia="Arial" w:hAnsi="Arial" w:cs="Arial"/>
-          <w:color w:val="212121"/>
-          <w:sz w:val="22"/>
-          <w:szCs w:val="22"/>
-        </w:rPr>
-        <w:t>• Pėdos ant grindų — kojos nesukryžiuotos, keliai ~90° kampu.</w:t>
-      </w:r>
-    </w:p>
-    <w:p>
-      <w:pPr>
-        <w:spacing w:after="80"/>
-      </w:pPr>
-      <w:r>
-        <w:rPr>
-          <w:rFonts w:ascii="Arial" w:eastAsia="Arial" w:hAnsi="Arial" w:cs="Arial"/>
-          <w:color w:val="212121"/>
-          <w:sz w:val="22"/>
-          <w:szCs w:val="22"/>
-        </w:rPr>
-        <w:t>• Rankos — alkūnės ~90° kampu, riešai tiesūs, ne sulenkti.</w:t>
-      </w:r>
-    </w:p>
-    <w:p>
-      <w:pPr>
-        <w:spacing w:after="80"/>
-      </w:pPr>
-      <w:r>
-        <w:rPr>
-          <w:rFonts w:ascii="Arial" w:eastAsia="Arial" w:hAnsi="Arial" w:cs="Arial"/>
-          <w:color w:val="212121"/>
-          <w:sz w:val="22"/>
-          <w:szCs w:val="22"/>
-        </w:rPr>
-        <w:t>• Ekranas — viršutinė ekran</w:t>
-      </w:r>
-      <w:r>
-        <w:rPr>
-          <w:rFonts w:ascii="Arial" w:eastAsia="Arial" w:hAnsi="Arial" w:cs="Arial"/>
-          <w:color w:val="212121"/>
-          <w:sz w:val="22"/>
-          <w:szCs w:val="22"/>
-        </w:rPr>
-        <w:t>o riba akių lygyje, atstumas ~50–70 cm.</w:t>
-      </w:r>
+        <w:t xml:space="preserve">Mokytojo veiksmai: </w:t>
+      </w:r>
+      <w:r>
+        <w:rPr>
+          <w:rFonts w:ascii="Arial" w:eastAsia="Arial" w:hAnsi="Arial" w:cs="Arial"/>
+          <w:color w:val="212121"/>
+          <w:sz w:val="22"/>
+          <w:szCs w:val="22"/>
+        </w:rPr>
+        <w:t>Dėstykite keturis ergonomikos blokus nuosekliai. Po kiekvieno bloko trumpai parodykite taisyklingą padėtį arba prašykite mokinių patikrinti savo įpročius.</w:t>
+      </w:r>
+    </w:p>
+    <w:p>
+      <w:pPr>
+        <w:spacing w:after="80"/>
+      </w:pPr>
+      <w:r>
+        <w:rPr>
+          <w:rFonts w:ascii="Arial" w:eastAsia="Arial" w:hAnsi="Arial" w:cs="Arial"/>
+          <w:b/>
+          <w:bCs/>
+          <w:color w:val="424242"/>
+          <w:sz w:val="22"/>
+          <w:szCs w:val="22"/>
+        </w:rPr>
+        <w:t xml:space="preserve">Mokinių veiksmai: </w:t>
+      </w:r>
+      <w:r>
+        <w:rPr>
+          <w:rFonts w:ascii="Arial" w:eastAsia="Arial" w:hAnsi="Arial" w:cs="Arial"/>
+          <w:color w:val="212121"/>
+          <w:sz w:val="22"/>
+          <w:szCs w:val="22"/>
+        </w:rPr>
+        <w:t>klausosi, stebi demonstravimą, bando patikrinti savo laikyseną ir ekrano padėtį.</w:t>
+      </w:r>
+    </w:p>
+    <w:p>
+      <w:pPr>
+        <w:spacing w:before="100"/>
+      </w:pPr>
+    </w:p>
+    <w:p>
+      <w:pPr>
+        <w:spacing w:after="80"/>
+      </w:pPr>
+      <w:r>
+        <w:rPr>
+          <w:rFonts w:ascii="Arial" w:eastAsia="Arial" w:hAnsi="Arial" w:cs="Arial"/>
+          <w:b/>
+          <w:bCs/>
+          <w:color w:val="212121"/>
+          <w:sz w:val="22"/>
+          <w:szCs w:val="22"/>
+        </w:rPr>
+        <w:t>1 blokas. Taisyklinga sėdėjimo laikysena (~5 min.)</w:t>
+      </w:r>
+    </w:p>
+    <w:p>
+      <w:pPr>
+        <w:spacing w:after="80"/>
+        <w:rPr>
+          <w:rFonts w:ascii="Arial" w:eastAsia="Arial" w:hAnsi="Arial" w:cs="Arial"/>
+          <w:color w:val="212121"/>
+          <w:sz w:val="22"/>
+          <w:szCs w:val="22"/>
+        </w:rPr>
+      </w:pPr>
+      <w:r>
+        <w:rPr>
+          <w:rFonts w:ascii="Arial" w:eastAsia="Arial" w:hAnsi="Arial" w:cs="Arial"/>
+          <w:color w:val="212121"/>
+          <w:sz w:val="22"/>
+          <w:szCs w:val="22"/>
+        </w:rPr>
+        <w:t>Paaiškinkite tris pagrindinius laikysenos taškus: pėdos ant grindų, nugara atremta į kėdės atlošą, pečiai atpalaiduoti. Par</w:t>
+      </w:r>
+      <w:r>
+        <w:rPr>
+          <w:rFonts w:ascii="Arial" w:eastAsia="Arial" w:hAnsi="Arial" w:cs="Arial"/>
+          <w:color w:val="212121"/>
+          <w:sz w:val="22"/>
+          <w:szCs w:val="22"/>
+        </w:rPr>
+        <w:t>odykite teisingai ir neteisingai prie savo stalo. Paprašykite mokinių patikrinti savo laikyseną dabar.</w:t>
+      </w:r>
+    </w:p>
+    <w:p>
+      <w:pPr>
+        <w:spacing w:after="80"/>
+      </w:pPr>
     </w:p>
     <w:p>
       <w:pPr>
@@ -1129,7 +1129,7 @@
           <w:sz w:val="22"/>
           <w:szCs w:val="22"/>
         </w:rPr>
-        <w:t xml:space="preserve">mokiniai mano, kad „patogi poza“ = taisyklinga poza. </w:t>
+        <w:t xml:space="preserve">Mokiniai linksta įlinkti per juosmenį arba sėdėti ant kėdės krašto. </w:t>
       </w:r>
       <w:r>
         <w:rPr>
@@ -1140,98 +1140,112 @@
           <w:sz w:val="22"/>
           <w:szCs w:val="22"/>
         </w:rPr>
-        <w:t>Taisyklė: patogi poza dažnai yra bloga — taisyklinga poza iš pradžių gali jaustis neįprastai.</w:t>
-      </w:r>
-    </w:p>
-    <w:p>
-      <w:pPr>
-        <w:spacing w:before="80"/>
-      </w:pPr>
-    </w:p>
-    <w:p>
-      <w:pPr>
-        <w:keepNext/>
-        <w:spacing w:after="80"/>
-      </w:pPr>
-      <w:r>
+        <w:t>Taisyklė: nugara turi liesti atlošą, kojos siekti grindis.</w:t>
+      </w:r>
+    </w:p>
+    <w:p>
+      <w:pPr>
+        <w:spacing w:after="80"/>
         <w:rPr>
           <w:rFonts w:ascii="Arial" w:eastAsia="Arial" w:hAnsi="Arial" w:cs="Arial"/>
           <w:b/>
           <w:bCs/>
-          <w:color w:val="424242"/>
-          <w:sz w:val="22"/>
-          <w:szCs w:val="22"/>
-        </w:rPr>
-        <w:lastRenderedPageBreak/>
-        <w:t xml:space="preserve">20-20-20 taisyklė (~4 min.): </w:t>
-      </w:r>
-    </w:p>
-    <w:p>
-      <w:pPr>
-        <w:spacing w:after="80"/>
-      </w:pPr>
-      <w:r>
-        <w:rPr>
-          <w:rFonts w:ascii="Arial" w:eastAsia="Arial" w:hAnsi="Arial" w:cs="Arial"/>
-          <w:color w:val="212121"/>
-          <w:sz w:val="22"/>
-          <w:szCs w:val="22"/>
-        </w:rPr>
-        <w:t>Paaiškinkite: kas 20 minučių — 20 sekundžių žiūrėti į objektą, esantį bent 20 pėdų (~6 m) atstumu.</w:t>
-      </w:r>
-    </w:p>
-    <w:p>
-      <w:pPr>
-        <w:spacing w:after="80"/>
-      </w:pPr>
-      <w:r>
-        <w:rPr>
-          <w:rFonts w:ascii="Arial" w:eastAsia="Arial" w:hAnsi="Arial" w:cs="Arial"/>
-          <w:color w:val="212121"/>
-          <w:sz w:val="22"/>
-          <w:szCs w:val="22"/>
-        </w:rPr>
-        <w:t>Kodėl veikia: akių raumenys atsipalaiduoja, kai fokusuojasi į tolimą tašką. Ilgas žiūrėjimas į artimą ekraną sukelia nuovargį ir sausumą.</w:t>
-      </w:r>
-    </w:p>
-    <w:p>
-      <w:pPr>
-        <w:keepLines/>
-        <w:shd w:val="clear" w:color="auto" w:fill="FFF8E1"/>
-        <w:spacing w:before="80" w:after="80"/>
-        <w:ind w:left="240"/>
+          <w:color w:val="212121"/>
+          <w:sz w:val="22"/>
+          <w:szCs w:val="22"/>
+        </w:rPr>
+      </w:pPr>
+    </w:p>
+    <w:p>
+      <w:pPr>
+        <w:spacing w:after="80"/>
       </w:pPr>
       <w:r>
         <w:rPr>
           <w:rFonts w:ascii="Arial" w:eastAsia="Arial" w:hAnsi="Arial" w:cs="Arial"/>
           <w:b/>
           <w:bCs/>
-          <w:color w:val="E65100"/>
-          <w:sz w:val="22"/>
-          <w:szCs w:val="22"/>
-        </w:rPr>
-        <w:t>⚠</w:t>
+          <w:color w:val="212121"/>
+          <w:sz w:val="22"/>
+          <w:szCs w:val="22"/>
+        </w:rPr>
+        <w:t xml:space="preserve">2 blokas. </w:t>
       </w:r>
       <w:r>
         <w:rPr>
           <w:rFonts w:ascii="Arial" w:eastAsia="Arial" w:hAnsi="Arial" w:cs="Arial"/>
           <w:b/>
           <w:bCs/>
-          <w:color w:val="E65100"/>
-          <w:sz w:val="22"/>
-          <w:szCs w:val="22"/>
-        </w:rPr>
-        <w:t xml:space="preserve"> Dažna klaida: </w:t>
-      </w:r>
-      <w:r>
-        <w:rPr>
-          <w:rFonts w:ascii="Arial" w:eastAsia="Arial" w:hAnsi="Arial" w:cs="Arial"/>
-          <w:color w:val="212121"/>
-          <w:sz w:val="22"/>
-          <w:szCs w:val="22"/>
-        </w:rPr>
-        <w:t xml:space="preserve">mokiniai sako „aš tiesiog mirkteliu — to pakanka“. </w:t>
-      </w:r>
+          <w:color w:val="212121"/>
+          <w:sz w:val="22"/>
+          <w:szCs w:val="22"/>
+        </w:rPr>
+        <w:t>Ekrano padėtis ir atstumas (~5 min.)</w:t>
+      </w:r>
+    </w:p>
+    <w:p>
+      <w:pPr>
+        <w:spacing w:after="80"/>
+        <w:rPr>
+          <w:rFonts w:ascii="Arial" w:eastAsia="Arial" w:hAnsi="Arial" w:cs="Arial"/>
+          <w:color w:val="212121"/>
+          <w:sz w:val="22"/>
+          <w:szCs w:val="22"/>
+        </w:rPr>
+      </w:pPr>
+      <w:r>
+        <w:rPr>
+          <w:rFonts w:ascii="Arial" w:eastAsia="Arial" w:hAnsi="Arial" w:cs="Arial"/>
+          <w:color w:val="212121"/>
+          <w:sz w:val="22"/>
+          <w:szCs w:val="22"/>
+        </w:rPr>
+        <w:t>Paaiškinkite: ekrano viršus turi būti akių lygyje arba šiek tiek žemiau. Atstumas nuo akių iki ekrano: ištiesta ranka. Ekranas neturi atspindėti šviesos. Parodykite, kaip pakreipti ekraną, kad nebūtų atspindžių.</w:t>
+      </w:r>
+    </w:p>
+    <w:p>
+      <w:pPr>
+        <w:spacing w:after="80"/>
+      </w:pPr>
+    </w:p>
+    <w:p>
+      <w:pPr>
+        <w:spacing w:after="80"/>
+        <w:rPr>
+          <w:rFonts w:ascii="Arial" w:eastAsia="Arial" w:hAnsi="Arial" w:cs="Arial"/>
+          <w:color w:val="212121"/>
+          <w:sz w:val="22"/>
+          <w:szCs w:val="22"/>
+        </w:rPr>
+      </w:pPr>
+      <w:r>
+        <w:rPr>
+          <w:rFonts w:ascii="Arial" w:eastAsia="Arial" w:hAnsi="Arial" w:cs="Arial"/>
+          <w:color w:val="212121"/>
+          <w:sz w:val="22"/>
+          <w:szCs w:val="22"/>
+        </w:rPr>
+        <w:t>Paprašy</w:t>
+      </w:r>
+      <w:r>
+        <w:rPr>
+          <w:rFonts w:ascii="Arial" w:eastAsia="Arial" w:hAnsi="Arial" w:cs="Arial"/>
+          <w:color w:val="212121"/>
+          <w:sz w:val="22"/>
+          <w:szCs w:val="22"/>
+        </w:rPr>
+        <w:t>kite mokinių patikrinti savo ekrano padėtį ir pakoreguoti.</w:t>
+      </w:r>
+    </w:p>
+    <w:p>
+      <w:pPr>
+        <w:spacing w:after="80"/>
+      </w:pPr>
+    </w:p>
+    <w:p>
+      <w:pPr>
+        <w:spacing w:after="80"/>
+      </w:pPr>
       <w:r>
         <w:rPr>
           <w:rFonts w:ascii="Arial" w:eastAsia="Arial" w:hAnsi="Arial" w:cs="Arial"/>
@@ -1241,17 +1255,70 @@
           <w:sz w:val="22"/>
           <w:szCs w:val="22"/>
         </w:rPr>
-        <w:t>Taisyklė: mirksėjimas — ne tas pats. Reikia 20 sekundžių žiūrėjimo į tolį, kad raumenys atsipalaiduotų.</w:t>
-      </w:r>
-    </w:p>
-    <w:p>
-      <w:pPr>
-        <w:spacing w:before="80"/>
-      </w:pPr>
-    </w:p>
-    <w:p>
-      <w:pPr>
-        <w:keepNext/>
+        <w:t>3 blokas. 20-20-20 taisyklė (~5 min.)</w:t>
+      </w:r>
+    </w:p>
+    <w:p>
+      <w:pPr>
+        <w:spacing w:after="80"/>
+        <w:rPr>
+          <w:rFonts w:ascii="Arial" w:eastAsia="Arial" w:hAnsi="Arial" w:cs="Arial"/>
+          <w:color w:val="212121"/>
+          <w:sz w:val="22"/>
+          <w:szCs w:val="22"/>
+        </w:rPr>
+      </w:pPr>
+      <w:r>
+        <w:rPr>
+          <w:rFonts w:ascii="Arial" w:eastAsia="Arial" w:hAnsi="Arial" w:cs="Arial"/>
+          <w:color w:val="212121"/>
+          <w:sz w:val="22"/>
+          <w:szCs w:val="22"/>
+        </w:rPr>
+        <w:t xml:space="preserve">Kas 20 minučių žiūrėti 20 sekundžių į objektą, esantį bent 20 pėdų (apie 6 metrus) atstumu. Paaiškinkite, kodėl tai veikia: akių raumenys, fokusuojantys arti, </w:t>
+      </w:r>
+      <w:r>
+        <w:rPr>
+          <w:rFonts w:ascii="Arial" w:eastAsia="Arial" w:hAnsi="Arial" w:cs="Arial"/>
+          <w:color w:val="212121"/>
+          <w:sz w:val="22"/>
+          <w:szCs w:val="22"/>
+        </w:rPr>
+        <w:t>nuo nuolatinio įtempimo pavargsta. Žiūrėjimas į tolį leidžia jiems atsipalaiduoti.</w:t>
+      </w:r>
+    </w:p>
+    <w:p>
+      <w:pPr>
+        <w:spacing w:after="80"/>
+      </w:pPr>
+    </w:p>
+    <w:p>
+      <w:pPr>
+        <w:spacing w:after="80"/>
+        <w:rPr>
+          <w:rFonts w:ascii="Arial" w:eastAsia="Arial" w:hAnsi="Arial" w:cs="Arial"/>
+          <w:color w:val="212121"/>
+          <w:sz w:val="22"/>
+          <w:szCs w:val="22"/>
+        </w:rPr>
+      </w:pPr>
+      <w:r>
+        <w:rPr>
+          <w:rFonts w:ascii="Arial" w:eastAsia="Arial" w:hAnsi="Arial" w:cs="Arial"/>
+          <w:color w:val="212121"/>
+          <w:sz w:val="22"/>
+          <w:szCs w:val="22"/>
+        </w:rPr>
+        <w:t>Praktinis momentas: atlikite 20-20-20 pratimą visi kartu dabar. Nurodykite objektą už lango.</w:t>
+      </w:r>
+    </w:p>
+    <w:p>
+      <w:pPr>
+        <w:spacing w:after="80"/>
+      </w:pPr>
+    </w:p>
+    <w:p>
+      <w:pPr>
         <w:spacing w:after="80"/>
       </w:pPr>
       <w:r>
@@ -1259,40 +1326,85 @@
           <w:rFonts w:ascii="Arial" w:eastAsia="Arial" w:hAnsi="Arial" w:cs="Arial"/>
           <w:b/>
           <w:bCs/>
-          <w:color w:val="424242"/>
-          <w:sz w:val="22"/>
-          <w:szCs w:val="22"/>
-        </w:rPr>
-        <w:t xml:space="preserve">Darbo–poilsio ritmas (~4 min.): </w:t>
-      </w:r>
-    </w:p>
-    <w:p>
-      <w:pPr>
-        <w:spacing w:after="80"/>
-      </w:pPr>
-      <w:r>
-        <w:rPr>
-          <w:rFonts w:ascii="Arial" w:eastAsia="Arial" w:hAnsi="Arial" w:cs="Arial"/>
-          <w:color w:val="212121"/>
-          <w:sz w:val="22"/>
-          <w:szCs w:val="22"/>
-        </w:rPr>
-        <w:t xml:space="preserve">Paaiškinkite, kad po 45–50 min. darbo prie ekrano reikia 5–10 min. </w:t>
-      </w:r>
-      <w:r>
-        <w:rPr>
-          <w:rFonts w:ascii="Arial" w:eastAsia="Arial" w:hAnsi="Arial" w:cs="Arial"/>
-          <w:color w:val="212121"/>
-          <w:sz w:val="22"/>
-          <w:szCs w:val="22"/>
-        </w:rPr>
-        <w:t>pertraukos.</w:t>
-      </w:r>
-    </w:p>
-    <w:p>
-      <w:pPr>
-        <w:spacing w:after="80"/>
-      </w:pPr>
+          <w:color w:val="212121"/>
+          <w:sz w:val="22"/>
+          <w:szCs w:val="22"/>
+        </w:rPr>
+        <w:t>4 blokas. Darbo ir poilsio ritmas, nuovargį šalinantys pratimai (~5 min.)</w:t>
+      </w:r>
+    </w:p>
+    <w:p>
+      <w:pPr>
+        <w:spacing w:after="80"/>
+        <w:rPr>
+          <w:rFonts w:ascii="Arial" w:eastAsia="Arial" w:hAnsi="Arial" w:cs="Arial"/>
+          <w:color w:val="212121"/>
+          <w:sz w:val="22"/>
+          <w:szCs w:val="22"/>
+        </w:rPr>
+      </w:pPr>
+      <w:r>
+        <w:rPr>
+          <w:rFonts w:ascii="Arial" w:eastAsia="Arial" w:hAnsi="Arial" w:cs="Arial"/>
+          <w:color w:val="212121"/>
+          <w:sz w:val="22"/>
+          <w:szCs w:val="22"/>
+        </w:rPr>
+        <w:t xml:space="preserve">Rekomenduokite kas 40–60 min. padaryti 5–10 min. pertrauką. Per pertrauką atsistoti, </w:t>
+      </w:r>
+      <w:r>
+        <w:rPr>
+          <w:rFonts w:ascii="Arial" w:eastAsia="Arial" w:hAnsi="Arial" w:cs="Arial"/>
+          <w:color w:val="212121"/>
+          <w:sz w:val="22"/>
+          <w:szCs w:val="22"/>
+        </w:rPr>
+        <w:t>pasiūbuoti</w:t>
+      </w:r>
+      <w:r>
+        <w:rPr>
+          <w:rFonts w:ascii="Arial" w:eastAsia="Arial" w:hAnsi="Arial" w:cs="Arial"/>
+          <w:color w:val="212121"/>
+          <w:sz w:val="22"/>
+          <w:szCs w:val="22"/>
+        </w:rPr>
+        <w:t>. Parodykite tris pratimus:</w:t>
+      </w:r>
+    </w:p>
+    <w:p>
+      <w:pPr>
+        <w:spacing w:after="80"/>
+      </w:pPr>
+    </w:p>
+    <w:p>
+      <w:pPr>
+        <w:spacing w:after="80"/>
+        <w:ind w:left="360"/>
+      </w:pPr>
+      <w:r>
+        <w:rPr>
+          <w:rFonts w:ascii="Arial" w:eastAsia="Arial" w:hAnsi="Arial" w:cs="Arial"/>
+          <w:color w:val="212121"/>
+          <w:sz w:val="22"/>
+          <w:szCs w:val="22"/>
+        </w:rPr>
+        <w:t>• Akių: užmerkti stipriai, atidaryti plačiai (5 kartus).</w:t>
+      </w:r>
+    </w:p>
+    <w:p>
+      <w:pPr>
+        <w:spacing w:after="80"/>
+        <w:ind w:left="360"/>
+      </w:pPr>
+      <w:r>
+        <w:rPr>
+          <w:rFonts w:ascii="Arial" w:eastAsia="Arial" w:hAnsi="Arial" w:cs="Arial"/>
+          <w:color w:val="212121"/>
+          <w:sz w:val="22"/>
+          <w:szCs w:val="22"/>
+        </w:rPr>
+        <w:t xml:space="preserve">• Rankų: </w:t>
+      </w:r>
       <w:proofErr w:type="spellStart"/>
       <w:r>
         <w:rPr>
@@ -1301,7 +1413,7 @@
           <w:sz w:val="22"/>
           <w:szCs w:val="22"/>
         </w:rPr>
-        <w:t>Pertraukėje</w:t>
+        <w:t>suimti</w:t>
       </w:r>
       <w:proofErr w:type="spellEnd"/>
       <w:r>
@@ -1311,175 +1423,63 @@
           <w:sz w:val="22"/>
           <w:szCs w:val="22"/>
         </w:rPr>
-        <w:t>: atsistoti, pasivaikščioti, atlikti pratimus. Ne pereiti prie telefono ekrano.</w:t>
-      </w:r>
-    </w:p>
-    <w:p>
-      <w:pPr>
-        <w:spacing w:after="80"/>
-      </w:pPr>
-      <w:r>
-        <w:rPr>
-          <w:rFonts w:ascii="Arial" w:eastAsia="Arial" w:hAnsi="Arial" w:cs="Arial"/>
-          <w:color w:val="212121"/>
-          <w:sz w:val="22"/>
-          <w:szCs w:val="22"/>
-        </w:rPr>
-        <w:t>Priežastis: ilgas sėdėjimas mažina kraujotaką, didina nugaros ir kaklo įtampą.</w:t>
-      </w:r>
-    </w:p>
-    <w:p>
-      <w:pPr>
-        <w:spacing w:before="80"/>
-      </w:pPr>
-    </w:p>
-    <w:p>
-      <w:pPr>
-        <w:keepNext/>
-        <w:spacing w:after="80"/>
-      </w:pPr>
-      <w:r>
-        <w:rPr>
-          <w:rFonts w:ascii="Arial" w:eastAsia="Arial" w:hAnsi="Arial" w:cs="Arial"/>
-          <w:b/>
-          <w:bCs/>
-          <w:color w:val="424242"/>
-          <w:sz w:val="22"/>
-          <w:szCs w:val="22"/>
-        </w:rPr>
-        <w:t xml:space="preserve">Nuovargį šalinančius pratimai (~5 min.): </w:t>
-      </w:r>
-    </w:p>
-    <w:p>
-      <w:pPr>
-        <w:spacing w:after="80"/>
-      </w:pPr>
-      <w:r>
-        <w:rPr>
-          <w:rFonts w:ascii="Arial" w:eastAsia="Arial" w:hAnsi="Arial" w:cs="Arial"/>
-          <w:color w:val="212121"/>
-          <w:sz w:val="22"/>
-          <w:szCs w:val="22"/>
-        </w:rPr>
-        <w:t>Parodykite ir kartu su klase at</w:t>
-      </w:r>
-      <w:r>
-        <w:rPr>
-          <w:rFonts w:ascii="Arial" w:eastAsia="Arial" w:hAnsi="Arial" w:cs="Arial"/>
-          <w:color w:val="212121"/>
-          <w:sz w:val="22"/>
-          <w:szCs w:val="22"/>
-        </w:rPr>
-        <w:t>likite:</w:t>
-      </w:r>
-    </w:p>
-    <w:p>
-      <w:pPr>
-        <w:spacing w:after="80"/>
-      </w:pPr>
-      <w:r>
-        <w:rPr>
-          <w:rFonts w:ascii="Arial" w:eastAsia="Arial" w:hAnsi="Arial" w:cs="Arial"/>
-          <w:color w:val="212121"/>
-          <w:sz w:val="22"/>
-          <w:szCs w:val="22"/>
-        </w:rPr>
-        <w:t>• Akių pratimai: žiūrėti į tolį → į artumą, sukioti akis ratu (po 10 s kiekviena kryptimi).</w:t>
-      </w:r>
-    </w:p>
-    <w:p>
-      <w:pPr>
-        <w:spacing w:after="80"/>
-      </w:pPr>
-      <w:r>
-        <w:rPr>
-          <w:rFonts w:ascii="Arial" w:eastAsia="Arial" w:hAnsi="Arial" w:cs="Arial"/>
-          <w:color w:val="212121"/>
-          <w:sz w:val="22"/>
-          <w:szCs w:val="22"/>
-        </w:rPr>
-        <w:t xml:space="preserve">• Rankų pratimai: ištiesti rankas į priekį, sukioti riešus, </w:t>
-      </w:r>
-      <w:proofErr w:type="spellStart"/>
-      <w:r>
-        <w:rPr>
-          <w:rFonts w:ascii="Arial" w:eastAsia="Arial" w:hAnsi="Arial" w:cs="Arial"/>
-          <w:color w:val="212121"/>
-          <w:sz w:val="22"/>
-          <w:szCs w:val="22"/>
-        </w:rPr>
-        <w:t>sugniažti</w:t>
-      </w:r>
-      <w:proofErr w:type="spellEnd"/>
-      <w:r>
-        <w:rPr>
-          <w:rFonts w:ascii="Arial" w:eastAsia="Arial" w:hAnsi="Arial" w:cs="Arial"/>
-          <w:color w:val="212121"/>
-          <w:sz w:val="22"/>
-          <w:szCs w:val="22"/>
-        </w:rPr>
-        <w:t>–</w:t>
-      </w:r>
-      <w:proofErr w:type="spellStart"/>
-      <w:r>
-        <w:rPr>
-          <w:rFonts w:ascii="Arial" w:eastAsia="Arial" w:hAnsi="Arial" w:cs="Arial"/>
-          <w:color w:val="212121"/>
-          <w:sz w:val="22"/>
-          <w:szCs w:val="22"/>
-        </w:rPr>
-        <w:t>atgniažti</w:t>
-      </w:r>
-      <w:proofErr w:type="spellEnd"/>
-      <w:r>
-        <w:rPr>
-          <w:rFonts w:ascii="Arial" w:eastAsia="Arial" w:hAnsi="Arial" w:cs="Arial"/>
-          <w:color w:val="212121"/>
-          <w:sz w:val="22"/>
-          <w:szCs w:val="22"/>
-        </w:rPr>
-        <w:t xml:space="preserve"> kumščius.</w:t>
-      </w:r>
-    </w:p>
-    <w:p>
-      <w:pPr>
-        <w:spacing w:after="80"/>
-      </w:pPr>
-      <w:r>
-        <w:rPr>
-          <w:rFonts w:ascii="Arial" w:eastAsia="Arial" w:hAnsi="Arial" w:cs="Arial"/>
-          <w:color w:val="212121"/>
-          <w:sz w:val="22"/>
-          <w:szCs w:val="22"/>
-        </w:rPr>
-        <w:t>• Nugaros pratimai: atsistoti, pakelti rankas virš galvos, pasilen</w:t>
-      </w:r>
-      <w:r>
-        <w:rPr>
-          <w:rFonts w:ascii="Arial" w:eastAsia="Arial" w:hAnsi="Arial" w:cs="Arial"/>
-          <w:color w:val="212121"/>
-          <w:sz w:val="22"/>
-          <w:szCs w:val="22"/>
-        </w:rPr>
-        <w:t>kti į šonus.</w:t>
-      </w:r>
-    </w:p>
-    <w:p>
-      <w:pPr>
-        <w:spacing w:after="80"/>
-      </w:pPr>
-      <w:r>
-        <w:rPr>
-          <w:rFonts w:ascii="Arial" w:eastAsia="Arial" w:hAnsi="Arial" w:cs="Arial"/>
-          <w:color w:val="212121"/>
-          <w:sz w:val="22"/>
-          <w:szCs w:val="22"/>
-        </w:rPr>
-        <w:t>Pabrėžkite: šiuos pratimus galima ir reikia daryti namuose.</w:t>
-      </w:r>
-      <w:r>
-        <w:t xml:space="preserve"> </w:t>
-      </w:r>
+        <w:t xml:space="preserve"> ir ištiesti pirštus, pasukti riešus ratais.</w:t>
+      </w:r>
+    </w:p>
+    <w:p>
+      <w:pPr>
+        <w:spacing w:after="80"/>
+        <w:ind w:left="360"/>
+        <w:rPr>
+          <w:rFonts w:ascii="Arial" w:eastAsia="Arial" w:hAnsi="Arial" w:cs="Arial"/>
+          <w:color w:val="212121"/>
+          <w:sz w:val="22"/>
+          <w:szCs w:val="22"/>
+        </w:rPr>
+      </w:pPr>
+      <w:r>
+        <w:rPr>
+          <w:rFonts w:ascii="Arial" w:eastAsia="Arial" w:hAnsi="Arial" w:cs="Arial"/>
+          <w:color w:val="212121"/>
+          <w:sz w:val="22"/>
+          <w:szCs w:val="22"/>
+        </w:rPr>
+        <w:t>• Nugaros: atsi</w:t>
+      </w:r>
+      <w:r>
+        <w:rPr>
+          <w:rFonts w:ascii="Arial" w:eastAsia="Arial" w:hAnsi="Arial" w:cs="Arial"/>
+          <w:color w:val="212121"/>
+          <w:sz w:val="22"/>
+          <w:szCs w:val="22"/>
+        </w:rPr>
+        <w:t>stoti, ištiesti rankas viršun, palinkti į šonus.</w:t>
+      </w:r>
+    </w:p>
+    <w:p>
+      <w:pPr>
+        <w:spacing w:after="80"/>
+        <w:ind w:left="360"/>
+      </w:pPr>
+    </w:p>
+    <w:p>
+      <w:pPr>
+        <w:spacing w:after="80"/>
+      </w:pPr>
+      <w:r>
+        <w:rPr>
+          <w:rFonts w:ascii="Arial" w:eastAsia="Arial" w:hAnsi="Arial" w:cs="Arial"/>
+          <w:color w:val="212121"/>
+          <w:sz w:val="22"/>
+          <w:szCs w:val="22"/>
+        </w:rPr>
+        <w:t>Atlikite visus tris pratimus kartu su klase.</w:t>
+      </w:r>
+    </w:p>
+    <w:p>
+      <w:pPr>
+        <w:spacing w:before="200"/>
+      </w:pPr>
     </w:p>
     <w:tbl>
       <w:tblPr>
@@ -1489,8 +1489,8 @@
           <w:left w:val="none" w:sz="0" w:space="0" w:color="FFFFFF"/>
           <w:bottom w:val="none" w:sz="0" w:space="0" w:color="FFFFFF"/>
           <w:right w:val="none" w:sz="0" w:space="0" w:color="FFFFFF"/>
-          <w:insideH w:val="single" w:sz="4" w:space="0" w:color="auto"/>
-          <w:insideV w:val="single" w:sz="4" w:space="0" w:color="auto"/>
+          <w:insideH w:val="none" w:sz="0" w:space="0" w:color="FFFFFF"/>
+          <w:insideV w:val="none" w:sz="0" w:space="0" w:color="FFFFFF"/>
         </w:tblBorders>
         <w:tblLayout w:type="fixed"/>
         <w:tblCellMar>
@@ -1560,7 +1560,7 @@
                 <w:rFonts w:ascii="Arial" w:eastAsia="Arial" w:hAnsi="Arial" w:cs="Arial"/>
                 <w:color w:val="757575"/>
               </w:rPr>
-              <w:t xml:space="preserve"> — ~8 min.</w:t>
+              <w:t xml:space="preserve"> — ~10 min.</w:t>
             </w:r>
           </w:p>
         </w:tc>
@@ -1568,35 +1568,8 @@
     </w:tbl>
     <w:p>
       <w:pPr>
-        <w:spacing w:before="80"/>
-      </w:pPr>
-    </w:p>
-    <w:p>
-      <w:pPr>
         <w:keepNext/>
         <w:spacing w:after="80"/>
-      </w:pPr>
-      <w:r>
-        <w:rPr>
-          <w:rFonts w:ascii="Arial" w:eastAsia="Arial" w:hAnsi="Arial" w:cs="Arial"/>
-          <w:color w:val="212121"/>
-          <w:sz w:val="22"/>
-          <w:szCs w:val="22"/>
-        </w:rPr>
-        <w:t>Mokiniai praktiškai taiko tai, ką išmoko.</w:t>
-      </w:r>
-    </w:p>
-    <w:p>
-      <w:pPr>
-        <w:spacing w:before="40"/>
-      </w:pPr>
-    </w:p>
-    <w:p>
-      <w:pPr>
-        <w:keepNext/>
-        <w:spacing w:after="80"/>
-      </w:pPr>
-      <w:r>
         <w:rPr>
           <w:rFonts w:ascii="Arial" w:eastAsia="Arial" w:hAnsi="Arial" w:cs="Arial"/>
           <w:b/>
@@ -1605,96 +1578,18 @@
           <w:sz w:val="22"/>
           <w:szCs w:val="22"/>
         </w:rPr>
-        <w:t xml:space="preserve">Užduotis: </w:t>
-      </w:r>
-      <w:r>
-        <w:rPr>
-          <w:rFonts w:ascii="Arial" w:eastAsia="Arial" w:hAnsi="Arial" w:cs="Arial"/>
-          <w:color w:val="212121"/>
-          <w:sz w:val="22"/>
-          <w:szCs w:val="22"/>
-        </w:rPr>
-        <w:t>„Patikrinkite ir sureguliuokite savo darbo vietą.“</w:t>
-      </w:r>
-    </w:p>
-    <w:p>
-      <w:pPr>
-        <w:spacing w:after="80"/>
-      </w:pPr>
-      <w:r>
-        <w:rPr>
-          <w:rFonts w:ascii="Arial" w:eastAsia="Arial" w:hAnsi="Arial" w:cs="Arial"/>
-          <w:color w:val="212121"/>
-          <w:sz w:val="22"/>
-          <w:szCs w:val="22"/>
-        </w:rPr>
-        <w:t>Kiekvienas mokinys prie savo stalo:</w:t>
-      </w:r>
-    </w:p>
-    <w:p>
-      <w:pPr>
-        <w:spacing w:after="80"/>
-      </w:pPr>
-      <w:r>
-        <w:rPr>
-          <w:rFonts w:ascii="Arial" w:eastAsia="Arial" w:hAnsi="Arial" w:cs="Arial"/>
-          <w:color w:val="212121"/>
-          <w:sz w:val="22"/>
-          <w:szCs w:val="22"/>
-        </w:rPr>
-        <w:t>1. Patikrina savo sėdėjimo pozą pagal aptartus principus.</w:t>
-      </w:r>
-    </w:p>
-    <w:p>
-      <w:pPr>
-        <w:spacing w:after="80"/>
-      </w:pPr>
-      <w:r>
-        <w:rPr>
-          <w:rFonts w:ascii="Arial" w:eastAsia="Arial" w:hAnsi="Arial" w:cs="Arial"/>
-          <w:color w:val="212121"/>
-          <w:sz w:val="22"/>
-          <w:szCs w:val="22"/>
-        </w:rPr>
-        <w:t>2. Sureguliuoja kėdės aukštį ir ekrano kampą (kiek leidžia įranga).</w:t>
-      </w:r>
-    </w:p>
-    <w:p>
-      <w:pPr>
-        <w:spacing w:after="80"/>
-      </w:pPr>
-      <w:r>
-        <w:rPr>
-          <w:rFonts w:ascii="Arial" w:eastAsia="Arial" w:hAnsi="Arial" w:cs="Arial"/>
-          <w:color w:val="212121"/>
-          <w:sz w:val="22"/>
-          <w:szCs w:val="22"/>
-        </w:rPr>
-        <w:t>3. Pasako garsiai klasei bent 1 dalyką, kurį pakeitė.</w:t>
-      </w:r>
-    </w:p>
-    <w:p>
-      <w:pPr>
-        <w:spacing w:after="80"/>
-      </w:pPr>
-      <w:r>
-        <w:rPr>
-          <w:rFonts w:ascii="Arial" w:eastAsia="Arial" w:hAnsi="Arial" w:cs="Arial"/>
-          <w:color w:val="212121"/>
-          <w:sz w:val="22"/>
-          <w:szCs w:val="22"/>
-        </w:rPr>
-        <w:t>4. Atlieka 20-20-20 pratimą kartu su klase (mokytojas skaičiuoja 20 s).</w:t>
-      </w:r>
-    </w:p>
-    <w:p>
-      <w:pPr>
-        <w:spacing w:before="40"/>
-      </w:pPr>
-    </w:p>
-    <w:p>
-      <w:pPr>
-        <w:spacing w:after="80"/>
+      </w:pPr>
+    </w:p>
+    <w:p>
+      <w:pPr>
+        <w:keepNext/>
+        <w:spacing w:after="80"/>
+        <w:rPr>
+          <w:rFonts w:ascii="Arial" w:eastAsia="Arial" w:hAnsi="Arial" w:cs="Arial"/>
+          <w:color w:val="212121"/>
+          <w:sz w:val="22"/>
+          <w:szCs w:val="22"/>
+        </w:rPr>
       </w:pPr>
       <w:r>
         <w:rPr>
@@ -1705,8 +1600,28 @@
           <w:sz w:val="22"/>
           <w:szCs w:val="22"/>
         </w:rPr>
-        <w:t>Ste</w:t>
-      </w:r>
+        <w:t xml:space="preserve">Mokytojo veiksmai: </w:t>
+      </w:r>
+      <w:r>
+        <w:rPr>
+          <w:rFonts w:ascii="Arial" w:eastAsia="Arial" w:hAnsi="Arial" w:cs="Arial"/>
+          <w:color w:val="212121"/>
+          <w:sz w:val="22"/>
+          <w:szCs w:val="22"/>
+        </w:rPr>
+        <w:t>perskaitykite užduoties instrukcijas. Vaikščiokite po klasę ir stebėkite, kaip mokiniai reguliuoja darbo vietas.</w:t>
+      </w:r>
+    </w:p>
+    <w:p>
+      <w:pPr>
+        <w:keepNext/>
+        <w:spacing w:after="80"/>
+      </w:pPr>
+    </w:p>
+    <w:p>
+      <w:pPr>
+        <w:spacing w:after="80"/>
+      </w:pPr>
       <w:r>
         <w:rPr>
           <w:rFonts w:ascii="Arial" w:eastAsia="Arial" w:hAnsi="Arial" w:cs="Arial"/>
@@ -1716,27 +1631,136 @@
           <w:sz w:val="22"/>
           <w:szCs w:val="22"/>
         </w:rPr>
-        <w:t xml:space="preserve">bėkite: </w:t>
-      </w:r>
-      <w:r>
-        <w:rPr>
-          <w:rFonts w:ascii="Arial" w:eastAsia="Arial" w:hAnsi="Arial" w:cs="Arial"/>
-          <w:color w:val="212121"/>
-          <w:sz w:val="22"/>
-          <w:szCs w:val="22"/>
-        </w:rPr>
-        <w:t>ar mokiniai tikrai keičia pozą, o ne tik sako „viskas gerai“. Jei matote tipinę klaidą — sustabdykite ir parodykite visai klasei.</w:t>
-      </w:r>
-    </w:p>
-    <w:p>
-      <w:pPr>
-        <w:spacing w:before="40"/>
-      </w:pPr>
-    </w:p>
-    <w:p>
-      <w:pPr>
-        <w:spacing w:after="80"/>
-      </w:pPr>
+        <w:t xml:space="preserve">Mokinių veiksmai: </w:t>
+      </w:r>
+      <w:r>
+        <w:rPr>
+          <w:rFonts w:ascii="Arial" w:eastAsia="Arial" w:hAnsi="Arial" w:cs="Arial"/>
+          <w:color w:val="212121"/>
+          <w:sz w:val="22"/>
+          <w:szCs w:val="22"/>
+        </w:rPr>
+        <w:t>individualiai reguliuoja savo darbo vietą pagal išmoktus principus ir atlieka pratimus.</w:t>
+      </w:r>
+    </w:p>
+    <w:p>
+      <w:pPr>
+        <w:spacing w:before="80"/>
+      </w:pPr>
+    </w:p>
+    <w:p>
+      <w:pPr>
+        <w:spacing w:after="80"/>
+      </w:pPr>
+      <w:r>
+        <w:rPr>
+          <w:rFonts w:ascii="Arial" w:eastAsia="Arial" w:hAnsi="Arial" w:cs="Arial"/>
+          <w:b/>
+          <w:bCs/>
+          <w:color w:val="212121"/>
+          <w:sz w:val="22"/>
+          <w:szCs w:val="22"/>
+        </w:rPr>
+        <w:t>Užduoties instrukcijos (skaidrėje):</w:t>
+      </w:r>
+    </w:p>
+    <w:p>
+      <w:pPr>
+        <w:spacing w:after="80"/>
+        <w:ind w:left="360"/>
+      </w:pPr>
+      <w:r>
+        <w:rPr>
+          <w:rFonts w:ascii="Arial" w:eastAsia="Arial" w:hAnsi="Arial" w:cs="Arial"/>
+          <w:color w:val="212121"/>
+          <w:sz w:val="22"/>
+          <w:szCs w:val="22"/>
+        </w:rPr>
+        <w:t xml:space="preserve">1. </w:t>
+      </w:r>
+      <w:r>
+        <w:rPr>
+          <w:rFonts w:ascii="Arial" w:eastAsia="Arial" w:hAnsi="Arial" w:cs="Arial"/>
+          <w:color w:val="212121"/>
+          <w:sz w:val="22"/>
+          <w:szCs w:val="22"/>
+        </w:rPr>
+        <w:t>Patikrinkite savo sėdėjimo laikyseną: ar pėdos ant grindų, ar nugara remiasi į atlošą, ar pečiai atpalaiduoti? Jei reikia, pakoreguokite.</w:t>
+      </w:r>
+    </w:p>
+    <w:p>
+      <w:pPr>
+        <w:spacing w:after="80"/>
+        <w:ind w:left="360"/>
+      </w:pPr>
+      <w:r>
+        <w:rPr>
+          <w:rFonts w:ascii="Arial" w:eastAsia="Arial" w:hAnsi="Arial" w:cs="Arial"/>
+          <w:color w:val="212121"/>
+          <w:sz w:val="22"/>
+          <w:szCs w:val="22"/>
+        </w:rPr>
+        <w:t>2</w:t>
+      </w:r>
+      <w:r>
+        <w:rPr>
+          <w:rFonts w:ascii="Arial" w:eastAsia="Arial" w:hAnsi="Arial" w:cs="Arial"/>
+          <w:color w:val="212121"/>
+          <w:sz w:val="22"/>
+          <w:szCs w:val="22"/>
+        </w:rPr>
+        <w:t>. Patikrinkite ekrano padėtį: ar viršus akių lygyje? Ar atstumas lygus ištiestai rankai? Pakoreguokite ekraną.</w:t>
+      </w:r>
+    </w:p>
+    <w:p>
+      <w:pPr>
+        <w:spacing w:after="80"/>
+        <w:ind w:left="360"/>
+      </w:pPr>
+      <w:r>
+        <w:rPr>
+          <w:rFonts w:ascii="Arial" w:eastAsia="Arial" w:hAnsi="Arial" w:cs="Arial"/>
+          <w:color w:val="212121"/>
+          <w:sz w:val="22"/>
+          <w:szCs w:val="22"/>
+        </w:rPr>
+        <w:t xml:space="preserve">3. </w:t>
+      </w:r>
+      <w:r>
+        <w:rPr>
+          <w:rFonts w:ascii="Arial" w:eastAsia="Arial" w:hAnsi="Arial" w:cs="Arial"/>
+          <w:color w:val="212121"/>
+          <w:sz w:val="22"/>
+          <w:szCs w:val="22"/>
+        </w:rPr>
+        <w:t>Atlikite tris pratimus: akių (užmerkti/atidaryti 5 kartus), rankų (pirštai + riešai), nugaros (išsitiesimas + palinkimas).</w:t>
+      </w:r>
+    </w:p>
+    <w:p>
+      <w:pPr>
+        <w:spacing w:after="80"/>
+        <w:ind w:left="360"/>
+      </w:pPr>
+      <w:r>
+        <w:rPr>
+          <w:rFonts w:ascii="Arial" w:eastAsia="Arial" w:hAnsi="Arial" w:cs="Arial"/>
+          <w:color w:val="212121"/>
+          <w:sz w:val="22"/>
+          <w:szCs w:val="22"/>
+        </w:rPr>
+        <w:t>4. Įvardinkite vieną dalyką, kurį namų darbo vietoje reikėtų pakeisti. Pasakykite garsiai, kai paklaus mokytojas.</w:t>
+      </w:r>
+    </w:p>
+    <w:p>
+      <w:pPr>
+        <w:spacing w:before="80"/>
+      </w:pPr>
+    </w:p>
+    <w:p>
+      <w:pPr>
+        <w:spacing w:after="80"/>
+      </w:pPr>
+      <w:bookmarkStart w:id="0" w:name="_GoBack"/>
       <w:r>
         <w:rPr>
           <w:rFonts w:ascii="Arial" w:eastAsia="Arial" w:hAnsi="Arial" w:cs="Arial"/>
@@ -1746,26 +1770,43 @@
           <w:sz w:val="22"/>
           <w:szCs w:val="22"/>
         </w:rPr>
-        <w:t xml:space="preserve">Apibendrinimas (~2 min.): </w:t>
-      </w:r>
-      <w:r>
-        <w:rPr>
-          <w:rFonts w:ascii="Arial" w:eastAsia="Arial" w:hAnsi="Arial" w:cs="Arial"/>
-          <w:color w:val="212121"/>
-          <w:sz w:val="22"/>
-          <w:szCs w:val="22"/>
-        </w:rPr>
-        <w:t>paklauskite 2–3 mokinių: „Ką pakeitei ir kodėl?“ Pabrėžkite, kad šiuos principus reikia tai</w:t>
-      </w:r>
-      <w:r>
-        <w:rPr>
-          <w:rFonts w:ascii="Arial" w:eastAsia="Arial" w:hAnsi="Arial" w:cs="Arial"/>
-          <w:color w:val="212121"/>
-          <w:sz w:val="22"/>
-          <w:szCs w:val="22"/>
-        </w:rPr>
-        <w:t>kyti kiekvieną dieną, ne tik šiandien.</w:t>
-      </w:r>
+        <w:t>Ką stebėti</w:t>
+      </w:r>
+      <w:bookmarkEnd w:id="0"/>
+      <w:r>
+        <w:rPr>
+          <w:rFonts w:ascii="Arial" w:eastAsia="Arial" w:hAnsi="Arial" w:cs="Arial"/>
+          <w:b/>
+          <w:bCs/>
+          <w:color w:val="424242"/>
+          <w:sz w:val="22"/>
+          <w:szCs w:val="22"/>
+        </w:rPr>
+        <w:t xml:space="preserve">: </w:t>
+      </w:r>
+      <w:r>
+        <w:rPr>
+          <w:rFonts w:ascii="Arial" w:eastAsia="Arial" w:hAnsi="Arial" w:cs="Arial"/>
+          <w:color w:val="212121"/>
+          <w:sz w:val="22"/>
+          <w:szCs w:val="22"/>
+        </w:rPr>
+        <w:t>ar mok</w:t>
+      </w:r>
+      <w:r>
+        <w:rPr>
+          <w:rFonts w:ascii="Arial" w:eastAsia="Arial" w:hAnsi="Arial" w:cs="Arial"/>
+          <w:color w:val="212121"/>
+          <w:sz w:val="22"/>
+          <w:szCs w:val="22"/>
+        </w:rPr>
+        <w:t>iniai reguliuoja kėdes ir ekranus, o ne tik apsimeta. Ar geba įvardinti konkretų pakeitimą namų darbo vietai.</w:t>
+      </w:r>
+    </w:p>
+    <w:p>
+      <w:pPr>
+        <w:spacing w:before="200"/>
+      </w:pPr>
     </w:p>
     <w:p>
       <w:pPr>
@@ -1780,8 +1821,8 @@
           <w:left w:val="none" w:sz="0" w:space="0" w:color="FFFFFF"/>
           <w:bottom w:val="none" w:sz="0" w:space="0" w:color="FFFFFF"/>
           <w:right w:val="none" w:sz="0" w:space="0" w:color="FFFFFF"/>
-          <w:insideH w:val="single" w:sz="4" w:space="0" w:color="auto"/>
-          <w:insideV w:val="single" w:sz="4" w:space="0" w:color="auto"/>
+          <w:insideH w:val="none" w:sz="0" w:space="0" w:color="FFFFFF"/>
+          <w:insideV w:val="none" w:sz="0" w:space="0" w:color="FFFFFF"/>
         </w:tblBorders>
         <w:tblLayout w:type="fixed"/>
         <w:tblCellMar>
@@ -1851,7 +1892,7 @@
                 <w:rFonts w:ascii="Arial" w:eastAsia="Arial" w:hAnsi="Arial" w:cs="Arial"/>
                 <w:color w:val="757575"/>
               </w:rPr>
-              <w:t xml:space="preserve"> — ~3 min.</w:t>
+              <w:t xml:space="preserve"> — ~4 min.</w:t>
             </w:r>
           </w:p>
         </w:tc>
@@ -1859,13 +1900,14 @@
     </w:tbl>
     <w:p>
       <w:pPr>
-        <w:spacing w:before="80"/>
-      </w:pPr>
-    </w:p>
-    <w:p>
-      <w:pPr>
         <w:keepNext/>
         <w:spacing w:after="80"/>
+        <w:rPr>
+          <w:rFonts w:ascii="Arial" w:eastAsia="Arial" w:hAnsi="Arial" w:cs="Arial"/>
+          <w:color w:val="212121"/>
+          <w:sz w:val="22"/>
+          <w:szCs w:val="22"/>
+        </w:rPr>
       </w:pPr>
       <w:r>
         <w:rPr>
@@ -1885,8 +1927,14 @@
           <w:sz w:val="22"/>
           <w:szCs w:val="22"/>
         </w:rPr>
-        <w:t>žodinis.</w:t>
-      </w:r>
+        <w:t>žodinis, klausinėjimas pasirinktinai.</w:t>
+      </w:r>
+    </w:p>
+    <w:p>
+      <w:pPr>
+        <w:keepNext/>
+        <w:spacing w:after="80"/>
+      </w:pPr>
     </w:p>
     <w:p>
       <w:pPr>
@@ -1911,7 +1959,7 @@
           <w:sz w:val="22"/>
           <w:szCs w:val="22"/>
         </w:rPr>
-        <w:t>Įvardink 3 taisyklingos sėdėjimo principus — negalima kartoti to, ką pasakė prieš tai kalbėjęs.</w:t>
+        <w:t>Įvardinkite tris taisyklingos sėdėjimo laikysenos taškus.</w:t>
       </w:r>
     </w:p>
     <w:p>
@@ -1937,19 +1985,13 @@
           <w:sz w:val="22"/>
           <w:szCs w:val="22"/>
         </w:rPr>
-        <w:t>Kas yra 20-20-20 taisyklė ir kodėl ji veikia? Paaiškink savais žodžiais.</w:t>
+        <w:t>Paaiškinkite 20-20-20 taisyklę: ką reikia daryti ir kodėl tai padeda akims?</w:t>
       </w:r>
     </w:p>
     <w:p>
       <w:pPr>
         <w:spacing w:after="60"/>
         <w:ind w:left="360"/>
-        <w:rPr>
-          <w:rFonts w:ascii="Arial" w:eastAsia="Arial" w:hAnsi="Arial" w:cs="Arial"/>
-          <w:color w:val="212121"/>
-          <w:sz w:val="22"/>
-          <w:szCs w:val="22"/>
-        </w:rPr>
       </w:pPr>
       <w:r>
         <w:rPr>
@@ -1969,28 +2011,13 @@
           <w:sz w:val="22"/>
           <w:szCs w:val="22"/>
         </w:rPr>
-        <w:t>Papasakok vieną pratimą, kurį gali daryti namuose po ilgo sėdėjimo prie kompiuterio.</w:t>
-      </w:r>
-    </w:p>
-    <w:p>
-      <w:pPr>
-        <w:spacing w:after="60"/>
-        <w:ind w:left="360"/>
-      </w:pPr>
-    </w:p>
-    <w:p>
-      <w:pPr>
-        <w:spacing w:after="60"/>
-        <w:ind w:left="360"/>
-      </w:pPr>
-    </w:p>
-    <w:p>
-      <w:pPr>
-        <w:spacing w:after="60"/>
-        <w:ind w:left="360"/>
-      </w:pPr>
-      <w:bookmarkStart w:id="0" w:name="_GoBack"/>
-      <w:bookmarkEnd w:id="0"/>
+        <w:t>Parodykite vieną nuovargį šalinantį pratimą ir pasakykite, kuriai kūno daliai jis skirtas.</w:t>
+      </w:r>
+    </w:p>
+    <w:p>
+      <w:pPr>
+        <w:spacing w:before="200"/>
+      </w:pPr>
     </w:p>
     <w:p>
       <w:pPr>
@@ -1998,7 +2025,7 @@
         <w:pBdr>
           <w:bottom w:val="single" w:sz="8" w:space="0" w:color="757575"/>
         </w:pBdr>
-        <w:spacing w:before="200" w:after="100"/>
+        <w:spacing w:after="80"/>
       </w:pPr>
     </w:p>
     <w:p>
@@ -2027,7 +2054,7 @@
           <w:sz w:val="21"/>
           <w:szCs w:val="21"/>
         </w:rPr>
-        <w:t>Pamokos metu mokiniai susipažino su ergonomikos principais dirban</w:t>
+        <w:t xml:space="preserve">Mokiniai susipažino su ergonomikos principais dirbant kompiuteriu. Išmoko taisyklingos sėdėjimo laikysenos, ekrano padėties ir atstumo taisyklių, 20-20-20 akių poilsio taisyklės bei nuovargį šalinančių pratimų. Praktikoje reguliavo savo darbo vietas pagal </w:t>
       </w:r>
       <w:r>
         <w:rPr>
@@ -2038,18 +2065,7 @@
           <w:sz w:val="21"/>
           <w:szCs w:val="21"/>
         </w:rPr>
-        <w:t>t kompiuteriu: taisyklinga sėdėjimo laikysena, ekrano padėtis, 20-20-20 akių poilsio taisyklė, darbo ir poilsio ritmas. Praktiškai atliko nuovargį šalinančius pratimus (akių, rankų, nugaros) ir sureguliavo savo darbo vietą pagal aptartus principus. Aptarė,</w:t>
-      </w:r>
-      <w:r>
-        <w:rPr>
-          <w:rFonts w:ascii="Arial" w:eastAsia="Arial" w:hAnsi="Arial" w:cs="Arial"/>
-          <w:i/>
-          <w:iCs/>
-          <w:color w:val="616161"/>
-          <w:sz w:val="21"/>
-          <w:szCs w:val="21"/>
-        </w:rPr>
-        <w:t xml:space="preserve"> kodėl kiekvienas principas padeda išvengti ilgalaikių sveikatos problemų.</w:t>
+        <w:t>išmoktus principus ir atliko pratimus.</w:t>
       </w:r>
     </w:p>
     <w:sectPr>
@@ -2065,10 +2081,10 @@
 <file path=word/numbering.xml><?xml version="1.0" encoding="utf-8"?>
 <w:numbering xmlns:wpc="http://schemas.microsoft.com/office/word/2010/wordprocessingCanvas" xmlns:cx="http://schemas.microsoft.com/office/drawing/2014/chartex" xmlns:cx1="http://schemas.microsoft.com/office/drawing/2015/9/8/chartex" xmlns:cx2="http://schemas.microsoft.com/office/drawing/2015/10/21/chartex" xmlns:cx3="http://schemas.microsoft.com/office/drawing/2016/5/9/chartex" xmlns:cx4="http://schemas.microsoft.com/office/drawing/2016/5/10/chartex" xmlns:cx5="http://schemas.microsoft.com/office/drawing/2016/5/11/chartex" xmlns:cx6="http://schemas.microsoft.com/office/drawing/2016/5/12/chartex" xmlns:cx7="http://schemas.microsoft.com/office/drawing/2016/5/13/chartex" xmlns:cx8="http://schemas.microsoft.com/office/drawing/2016/5/14/chartex" xmlns:mc="http://schemas.openxmlformats.org/markup-compatibility/2006" xmlns:aink="http://schemas.microsoft.com/office/drawing/2016/ink" xmlns:am3d="http://schemas.microsoft.com/office/drawing/2017/model3d" xmlns:o="urn:schemas-microsoft-com:office:office" xmlns:r="http://schemas.openxmlformats.org/officeDocument/2006/relationships" xmlns:m="http://schemas.openxmlformats.org/officeDocument/2006/math" xmlns:v="urn:schemas-microsoft-com:vml" xmlns:wp14="http://schemas.microsoft.com/office/word/2010/wordprocessingDrawing" xmlns:wp="http://schemas.openxmlformats.org/drawingml/2006/wordprocessingDrawing" xmlns:w10="urn:schemas-microsoft-com:office:word" xmlns:w="http://schemas.openxmlformats.org/wordprocessingml/2006/main" xmlns:w14="http://schemas.microsoft.com/office/word/2010/wordml" xmlns:w15="http://schemas.microsoft.com/office/word/2012/wordml" xmlns:w16cid="http://schemas.microsoft.com/office/word/2016/wordml/cid" xmlns:w16se="http://schemas.microsoft.com/office/word/2015/wordml/symex" xmlns:wpg="http://schemas.microsoft.com/office/word/2010/wordprocessingGroup" xmlns:wpi="http://schemas.microsoft.com/office/word/2010/wordprocessingInk" xmlns:wne="http://schemas.microsoft.com/office/word/2006/wordml" xmlns:wps="http://schemas.microsoft.com/office/word/2010/wordprocessingShape" mc:Ignorable="w14 w15 w16se w16cid wp14">
   <w:abstractNum w:abstractNumId="0" w15:restartNumberingAfterBreak="0">
-    <w:nsid w:val="017B73DC"/>
+    <w:nsid w:val="5E2754FB"/>
     <w:multiLevelType w:val="hybridMultilevel"/>
-    <w:tmpl w:val="04F47028"/>
-    <w:lvl w:ilvl="0" w:tplc="09E883FE">
+    <w:tmpl w:val="CCF0CC7E"/>
+    <w:lvl w:ilvl="0" w:tplc="732A7460">
       <w:start w:val="1"/>
       <w:numFmt w:val="bullet"/>
       <w:lvlText w:val="●"/>
@@ -2077,7 +2093,7 @@
         <w:ind w:left="720" w:hanging="360"/>
       </w:pPr>
     </w:lvl>
-    <w:lvl w:ilvl="1" w:tplc="1B90CB20">
+    <w:lvl w:ilvl="1" w:tplc="F3688FFC">
       <w:start w:val="1"/>
       <w:numFmt w:val="bullet"/>
       <w:lvlText w:val="○"/>
@@ -2086,7 +2102,7 @@
         <w:ind w:left="1440" w:hanging="360"/>
       </w:pPr>
     </w:lvl>
-    <w:lvl w:ilvl="2" w:tplc="FFC4B018">
+    <w:lvl w:ilvl="2" w:tplc="32C89F84">
       <w:start w:val="1"/>
       <w:numFmt w:val="bullet"/>
       <w:lvlText w:val="■"/>
@@ -2095,7 +2111,7 @@
         <w:ind w:left="2160" w:hanging="360"/>
       </w:pPr>
     </w:lvl>
-    <w:lvl w:ilvl="3" w:tplc="00F27EFA">
+    <w:lvl w:ilvl="3" w:tplc="34FAE0BE">
       <w:start w:val="1"/>
       <w:numFmt w:val="bullet"/>
       <w:lvlText w:val="●"/>
@@ -2104,7 +2120,7 @@
         <w:ind w:left="2880" w:hanging="360"/>
       </w:pPr>
     </w:lvl>
-    <w:lvl w:ilvl="4" w:tplc="CD32AFAE">
+    <w:lvl w:ilvl="4" w:tplc="5BBEE606">
       <w:start w:val="1"/>
       <w:numFmt w:val="bullet"/>
       <w:lvlText w:val="○"/>
@@ -2113,7 +2129,7 @@
         <w:ind w:left="3600" w:hanging="360"/>
       </w:pPr>
     </w:lvl>
-    <w:lvl w:ilvl="5" w:tplc="308CC1CC">
+    <w:lvl w:ilvl="5" w:tplc="00EE1A86">
       <w:start w:val="1"/>
       <w:numFmt w:val="bullet"/>
       <w:lvlText w:val="■"/>
@@ -2122,7 +2138,7 @@
         <w:ind w:left="4320" w:hanging="360"/>
       </w:pPr>
     </w:lvl>
-    <w:lvl w:ilvl="6" w:tplc="5D784B30">
+    <w:lvl w:ilvl="6" w:tplc="F02A3B44">
       <w:start w:val="1"/>
       <w:numFmt w:val="bullet"/>
       <w:lvlText w:val="●"/>
@@ -2131,7 +2147,7 @@
         <w:ind w:left="5040" w:hanging="360"/>
       </w:pPr>
     </w:lvl>
-    <w:lvl w:ilvl="7" w:tplc="DACA3452">
+    <w:lvl w:ilvl="7" w:tplc="13E46F0A">
       <w:start w:val="1"/>
       <w:numFmt w:val="bullet"/>
       <w:lvlText w:val="●"/>
@@ -2140,7 +2156,7 @@
         <w:ind w:left="5760" w:hanging="360"/>
       </w:pPr>
     </w:lvl>
-    <w:lvl w:ilvl="8" w:tplc="B0728374">
+    <w:lvl w:ilvl="8" w:tplc="2EF6E01E">
       <w:start w:val="1"/>
       <w:numFmt w:val="bullet"/>
       <w:lvlText w:val="●"/>

</xml_diff>

<commit_message>
Safety module inconsistency fixes and module QA report fixes.
</commit_message>
<xml_diff>
--- a/Grade_9/Semester_1/01_Safety/001_L - Ergonomics & healthy computer use/Teacher_Plan.docx
+++ b/Grade_9/Semester_1/01_Safety/001_L - Ergonomics & healthy computer use/Teacher_Plan.docx
@@ -99,7 +99,7 @@
                 <w:sz w:val="22"/>
                 <w:szCs w:val="22"/>
               </w:rPr>
-              <w:t xml:space="preserve">L — Mokymosi pamoka (1 iš 4 apie saugą)</w:t>
+              <w:t xml:space="preserve">L: Mokymosi pamoka (1 iš 4 apie saugą)</w:t>
             </w:r>
           </w:p>
         </w:tc>
@@ -536,7 +536,7 @@
           <w:sz w:val="20"/>
           <w:szCs w:val="20"/>
         </w:rPr>
-        <w:t xml:space="preserve"> — ~3 min.</w:t>
+        <w:t xml:space="preserve">, ~3 min.</w:t>
       </w:r>
     </w:p>
     <w:p>
@@ -585,7 +585,7 @@
           <w:sz w:val="22"/>
           <w:szCs w:val="22"/>
         </w:rPr>
-        <w:t xml:space="preserve">Tai pirma metų pamoka — klausimai remiasi bendra patirtimi, ne praeita pamoka.</w:t>
+        <w:t xml:space="preserve">Tai pirma metų pamoka, todėl klausimai remiasi bendra patirtimi, ne praeita pamoka.</w:t>
       </w:r>
     </w:p>
     <w:p>
@@ -611,7 +611,7 @@
           <w:sz w:val="22"/>
           <w:szCs w:val="22"/>
         </w:rPr>
-        <w:t xml:space="preserve">Ar tau kartais skauda nugarą arba akis po ilgo darbo prie kompiuterio? Kodėl taip manai?</w:t>
+        <w:t xml:space="preserve">Ar jums kartais skauda nugarą arba akis po ilgo darbo prie kompiuterio? Kodėl taip manote?</w:t>
       </w:r>
     </w:p>
     <w:p>
@@ -680,7 +680,7 @@
           <w:sz w:val="20"/>
           <w:szCs w:val="20"/>
         </w:rPr>
-        <w:t xml:space="preserve">(Ryšys su nauja tema: „Šiandien sužinosime, kodėl šie dalykai vyksta ir kaip jų išvengti — tai vadinasi ergonomika.“)</w:t>
+        <w:t xml:space="preserve">(Ryšys su nauja tema: „Šiandien sužinosime, kodėl šie dalykai vyksta ir kaip jų išvengti: tai vadinasi ergonomika.“)</w:t>
       </w:r>
     </w:p>
     <w:p>
@@ -706,7 +706,7 @@
           <w:sz w:val="20"/>
           <w:szCs w:val="20"/>
         </w:rPr>
-        <w:t xml:space="preserve"> — ~20 min.</w:t>
+        <w:t xml:space="preserve">, ~20 min.</w:t>
       </w:r>
     </w:p>
     <w:p>
@@ -730,7 +730,7 @@
           <w:sz w:val="22"/>
           <w:szCs w:val="22"/>
         </w:rPr>
-        <w:t xml:space="preserve">Pamokos fokusas (~2 min.): parodykite ekrane žmogų, sėdintį netaisyklingai prie kompiuterio. Paklauskite: „Kas čia blogai?“ Surinkite 2–3 atsakymus ir pasakykite, kad šiandien sistemingai viską aptarsite.</w:t>
+        <w:t xml:space="preserve">Pamokos fokusas (~2 min.): paprašykite vieno mokinio atsisėsti taip, kaip paprastai sėdi prie kompiuterio. Paklauskite klasės: „Kas čia blogai?“ Surinkite 2–3 atsakymus ir pasakykite, kad šiandien sistemingai viską aptarsite.</w:t>
       </w:r>
     </w:p>
     <w:p>
@@ -756,7 +756,7 @@
           <w:sz w:val="20"/>
           <w:szCs w:val="20"/>
         </w:rPr>
-        <w:t xml:space="preserve"> — ~5 min.</w:t>
+        <w:t xml:space="preserve">, ~5 min.</w:t>
       </w:r>
     </w:p>
     <w:p>
@@ -785,7 +785,7 @@
           <w:sz w:val="22"/>
           <w:szCs w:val="22"/>
         </w:rPr>
-        <w:t xml:space="preserve">• Nugaros atrama — nugara liečia kėdės atlošą, ne palinkusi į priekį.</w:t>
+        <w:t xml:space="preserve">• Nugaros atrama: nugara liečia kėdės atlošą, ne palinkusi į priekį.</w:t>
       </w:r>
     </w:p>
     <w:p>
@@ -800,7 +800,7 @@
           <w:sz w:val="22"/>
           <w:szCs w:val="22"/>
         </w:rPr>
-        <w:t xml:space="preserve">• Pėdos ant grindų — kojos nesukryžiuotos, keliai ~90° kampu.</w:t>
+        <w:t xml:space="preserve">• Pėdos ant grindų: kojos nesukryžiuotos, keliai ~90° kampu.</w:t>
       </w:r>
     </w:p>
     <w:p>
@@ -815,7 +815,7 @@
           <w:sz w:val="22"/>
           <w:szCs w:val="22"/>
         </w:rPr>
-        <w:t xml:space="preserve">• Rankos — alkūnės ~90° kampu, riešai tiesūs, ne sulenkti.</w:t>
+        <w:t xml:space="preserve">• Rankos: alkūnės ~90° kampu, riešai tiesūs, ne sulenkti.</w:t>
       </w:r>
     </w:p>
     <w:p>
@@ -830,7 +830,7 @@
           <w:sz w:val="22"/>
           <w:szCs w:val="22"/>
         </w:rPr>
-        <w:t xml:space="preserve">• Ekranas — viršutinė ekrano riba akių lygyje, atstumas ~50–70 cm.</w:t>
+        <w:t xml:space="preserve">• Ekranas: viršutinė ekrano riba akių lygyje, atstumas ~50–70 cm.</w:t>
       </w:r>
     </w:p>
     <w:p>
@@ -869,7 +869,7 @@
           <w:sz w:val="22"/>
           <w:szCs w:val="22"/>
         </w:rPr>
-        <w:t xml:space="preserve">Taisyklė: patogi poza dažnai yra bloga — taisyklinga poza iš pradžių gali jaustis neįprastai.</w:t>
+        <w:t xml:space="preserve">Taisyklė: patogi poza dažnai yra bloga, o taisyklinga poza iš pradžių gali jaustis neįprastai.</w:t>
       </w:r>
     </w:p>
     <w:p>
@@ -895,7 +895,7 @@
           <w:sz w:val="20"/>
           <w:szCs w:val="20"/>
         </w:rPr>
-        <w:t xml:space="preserve"> — ~4 min.</w:t>
+        <w:t xml:space="preserve">, ~4 min.</w:t>
       </w:r>
     </w:p>
     <w:p>
@@ -909,7 +909,7 @@
           <w:sz w:val="22"/>
           <w:szCs w:val="22"/>
         </w:rPr>
-        <w:t xml:space="preserve">Paaiškinkite: kas 20 minučių — 20 sekundžių žiūrėti į objektą, esantį bent 20 pėdų (~6 m) atstumu.</w:t>
+        <w:t xml:space="preserve">Paaiškinkite: kas 20 minučių: 20 sekundžių žiūrėti į objektą, esantį bent 20 pėdų (~6 m) atstumu.</w:t>
       </w:r>
     </w:p>
     <w:p>
@@ -951,18 +951,18 @@
           <w:sz w:val="22"/>
           <w:szCs w:val="22"/>
         </w:rPr>
-        <w:t xml:space="preserve">mokiniai sako „aš tiesiog mirkteliu — to pakanka“. </w:t>
-      </w:r>
-      <w:r>
-        <w:rPr>
-          <w:rFonts w:ascii="Arial" w:cs="Arial" w:eastAsia="Arial" w:hAnsi="Arial"/>
-          <w:b/>
-          <w:bCs/>
-          <w:color w:val="333333"/>
-          <w:sz w:val="22"/>
-          <w:szCs w:val="22"/>
-        </w:rPr>
-        <w:t xml:space="preserve">Taisyklė: mirksėjimas — ne tas pats. Reikia 20 sekundžių žiūrėjimo į tolį, kad raumenys atsipalaiduotų.</w:t>
+        <w:t xml:space="preserve">mokiniai sako „aš tiesiog mirkteliu, to pakanka“. </w:t>
+      </w:r>
+      <w:r>
+        <w:rPr>
+          <w:rFonts w:ascii="Arial" w:cs="Arial" w:eastAsia="Arial" w:hAnsi="Arial"/>
+          <w:b/>
+          <w:bCs/>
+          <w:color w:val="333333"/>
+          <w:sz w:val="22"/>
+          <w:szCs w:val="22"/>
+        </w:rPr>
+        <w:t xml:space="preserve">Taisyklė: mirksėjimas: ne tas pats. Reikia 20 sekundžių žiūrėjimo į tolį, kad raumenys atsipalaiduotų.</w:t>
       </w:r>
     </w:p>
     <w:p>
@@ -988,7 +988,7 @@
           <w:sz w:val="20"/>
           <w:szCs w:val="20"/>
         </w:rPr>
-        <w:t xml:space="preserve"> — ~4 min.</w:t>
+        <w:t xml:space="preserve">, ~4 min.</w:t>
       </w:r>
     </w:p>
     <w:p>
@@ -1056,7 +1056,7 @@
           <w:sz w:val="20"/>
           <w:szCs w:val="20"/>
         </w:rPr>
-        <w:t xml:space="preserve"> — ~5 min.</w:t>
+        <w:t xml:space="preserve">, ~5 min.</w:t>
       </w:r>
     </w:p>
     <w:p>
@@ -1155,7 +1155,7 @@
           <w:sz w:val="20"/>
           <w:szCs w:val="20"/>
         </w:rPr>
-        <w:t xml:space="preserve"> — ~8 min.</w:t>
+        <w:t xml:space="preserve">, ~8 min.</w:t>
       </w:r>
     </w:p>
     <w:p>
@@ -1343,7 +1343,7 @@
           <w:sz w:val="22"/>
           <w:szCs w:val="22"/>
         </w:rPr>
-        <w:t xml:space="preserve"> ar mokiniai tikrai keičia pozą, o ne tik sako „viskas gerai“. Jei matote tipinę klaidą — sustabdykite ir parodykite visai klasei.</w:t>
+        <w:t xml:space="preserve"> ar mokiniai tikrai keičia pozą, o ne tik sako „viskas gerai“. Jei matote tipinę klaidą, sustabdykite ir parodykite visai klasei.</w:t>
       </w:r>
     </w:p>
     <w:p>
@@ -1383,7 +1383,7 @@
           <w:sz w:val="20"/>
           <w:szCs w:val="20"/>
         </w:rPr>
-        <w:t xml:space="preserve"> — ~3 min.</w:t>
+        <w:t xml:space="preserve">, ~3 min.</w:t>
       </w:r>
     </w:p>
     <w:p>
@@ -1443,7 +1443,7 @@
           <w:sz w:val="22"/>
           <w:szCs w:val="22"/>
         </w:rPr>
-        <w:t xml:space="preserve">Įvardink 3 taisyklingos sėdėjimo principus — negalima kartoti to, ką pasakė prieš tai kalbėjęs.</w:t>
+        <w:t xml:space="preserve">Įvardink 3 taisyklingos sėdėjimo principus; negalima kartoti to, ką pasakė prieš tai kalbėjęs.</w:t>
       </w:r>
     </w:p>
     <w:p>

</xml_diff>